<commit_message>
Implement calibrated LR defaults and five research improvements
</commit_message>
<xml_diff>
--- a/literature-review.docx
+++ b/literature-review.docx
@@ -48,7 +48,7 @@
     </w:p>
     <w:p>
       <w:r>
-        <w:t>17 October 2026  •  62 source records  •  Protocol frw-v2</w:t>
+        <w:t>17 October 2026  •  62 source records  •  Review baseline: frw-v2; implementation: frw-v3</w:t>
       </w:r>
     </w:p>
     <w:p>
@@ -286,7 +286,18 @@
     </w:p>
     <w:p>
       <w:r>
-        <w:t>The following recommendations are proposals. They have not been silently implemented in the experiment suite. Existing controls and results must remain distinguishable from any adopted amendment.</w:t>
+        <w:t xml:space="preserve">This review describes the audited frw-v2 baseline. A subsequent user-authorized implementation adopts per-task gates, LR/head calibration, update-capacity measurements and subspace diagnostics in the </w:t>
+      </w:r>
+      <w:hyperlink r:id="rId11" w:history="1">
+        <w:r>
+          <w:rPr>
+            <w:color w:val="1F4E78"/>
+          </w:rPr>
+          <w:t xml:space="preserve">frw-v3 amendment</w:t>
+        </w:r>
+      </w:hyperlink>
+      <w:r>
+        <w:t>. Remaining recommendations are proposals. Existing controls and results remain distinguishable from the amendment; no production experiment results are claimed.</w:t>
       </w:r>
     </w:p>
     <w:p>
@@ -6359,7 +6370,7 @@
     </w:p>
     <w:p>
       <w:r>
-        <w:t>Priority P1 means the best return for this FYP; P2 means a targeted follow-up after the core design is sound; P3 means optional future work. “New” identifies work absent from the current suite. “Extend” means the suite already supplies part of the measurement. These are design recommendations and candidate values, not claims of demonstrated improvement.</w:t>
+        <w:t>Priority P1 means the best return for this FYP; P2 means a targeted follow-up after the core design is sound; P3 means optional future work. “New” identifies work absent from the reviewed v2 baseline. “Extend” means that baseline already supplies part of the measurement. The subsequent v3 implementation is identified in the executive assessment and protocol amendment. These are design recommendations and candidate values, not claims of demonstrated improvement.</w:t>
       </w:r>
     </w:p>
     <w:p>
@@ -11470,49 +11481,6 @@
       <w:r>
         <w:t xml:space="preserve">Psychology of Learning and Motivation 24, 109–165. </w:t>
       </w:r>
-      <w:hyperlink r:id="rId11" w:history="1">
-        <w:r>
-          <w:rPr>
-            <w:color w:val="1F4E78"/>
-            <w:sz w:val="20"/>
-          </w:rPr>
-          <w:t xml:space="preserve">Primary source</w:t>
-        </w:r>
-      </w:hyperlink>
-    </w:p>
-    <w:p>
-      <w:pPr>
-        <w:spacing w:after="100"/>
-        <w:ind w:left="454"/>
-      </w:pPr>
-      <w:r>
-        <w:rPr>
-          <w:color w:val="536579"/>
-          <w:sz w:val="17"/>
-        </w:rPr>
-        <w:t>Access: Historical context; author-institution record and indexed original chapter. Publisher endpoint unavailable.</w:t>
-      </w:r>
-    </w:p>
-    <w:p>
-      <w:bookmarkStart w:id="2" w:name="reference_2"/>
-      <w:pPr>
-        <w:keepNext/>
-        <w:spacing w:before="80" w:after="40"/>
-        <w:ind w:left="454" w:hanging="454"/>
-      </w:pPr>
-      <w:bookmarkEnd w:id="2"/>
-      <w:r>
-        <w:t xml:space="preserve">[2] Kirkpatrick, J., et al. (2017). </w:t>
-      </w:r>
-      <w:r>
-        <w:rPr>
-          <w:i/>
-        </w:rPr>
-        <w:t xml:space="preserve">Overcoming catastrophic forgetting in neural networks. </w:t>
-      </w:r>
-      <w:r>
-        <w:t xml:space="preserve">PNAS 114(13), 3521–3526. </w:t>
-      </w:r>
       <w:hyperlink r:id="rId12" w:history="1">
         <w:r>
           <w:rPr>
@@ -11533,28 +11501,28 @@
           <w:color w:val="536579"/>
           <w:sz w:val="17"/>
         </w:rPr>
-        <w:t>Access: Primary abstract and bibliographic record.</w:t>
+        <w:t>Access: Historical context; author-institution record and indexed original chapter. Publisher endpoint unavailable.</w:t>
       </w:r>
     </w:p>
     <w:p>
-      <w:bookmarkStart w:id="3" w:name="reference_3"/>
+      <w:bookmarkStart w:id="2" w:name="reference_2"/>
       <w:pPr>
         <w:keepNext/>
         <w:spacing w:before="80" w:after="40"/>
         <w:ind w:left="454" w:hanging="454"/>
       </w:pPr>
-      <w:bookmarkEnd w:id="3"/>
-      <w:r>
-        <w:t xml:space="preserve">[3] van de Ven, G. M., and Tolias, A. S. (2019). </w:t>
+      <w:bookmarkEnd w:id="2"/>
+      <w:r>
+        <w:t xml:space="preserve">[2] Kirkpatrick, J., et al. (2017). </w:t>
       </w:r>
       <w:r>
         <w:rPr>
           <w:i/>
         </w:rPr>
-        <w:t xml:space="preserve">Three scenarios for continual learning. </w:t>
-      </w:r>
-      <w:r>
-        <w:t xml:space="preserve">arXiv:1904.07734. </w:t>
+        <w:t xml:space="preserve">Overcoming catastrophic forgetting in neural networks. </w:t>
+      </w:r>
+      <w:r>
+        <w:t xml:space="preserve">PNAS 114(13), 3521–3526. </w:t>
       </w:r>
       <w:hyperlink r:id="rId13" w:history="1">
         <w:r>
@@ -11576,28 +11544,28 @@
           <w:color w:val="536579"/>
           <w:sz w:val="17"/>
         </w:rPr>
-        <w:t>Access: Primary abstract; task-identity taxonomy.</w:t>
+        <w:t>Access: Primary abstract and bibliographic record.</w:t>
       </w:r>
     </w:p>
     <w:p>
-      <w:bookmarkStart w:id="4" w:name="reference_4"/>
+      <w:bookmarkStart w:id="3" w:name="reference_3"/>
       <w:pPr>
         <w:keepNext/>
         <w:spacing w:before="80" w:after="40"/>
         <w:ind w:left="454" w:hanging="454"/>
       </w:pPr>
-      <w:bookmarkEnd w:id="4"/>
-      <w:r>
-        <w:t xml:space="preserve">[4] De Lange, M., et al. (2022). </w:t>
+      <w:bookmarkEnd w:id="3"/>
+      <w:r>
+        <w:t xml:space="preserve">[3] van de Ven, G. M., and Tolias, A. S. (2019). </w:t>
       </w:r>
       <w:r>
         <w:rPr>
           <w:i/>
         </w:rPr>
-        <w:t xml:space="preserve">A Continual Learning Survey: Defying Forgetting in Classification Tasks. </w:t>
-      </w:r>
-      <w:r>
-        <w:t xml:space="preserve">IEEE TPAMI 44(7), 3366–3385; online 2021. </w:t>
+        <w:t xml:space="preserve">Three scenarios for continual learning. </w:t>
+      </w:r>
+      <w:r>
+        <w:t xml:space="preserve">arXiv:1904.07734. </w:t>
       </w:r>
       <w:hyperlink r:id="rId14" w:history="1">
         <w:r>
@@ -11619,28 +11587,28 @@
           <w:color w:val="536579"/>
           <w:sz w:val="17"/>
         </w:rPr>
-        <w:t>Access: Primary survey abstract and relevant evaluation discussion.</w:t>
+        <w:t>Access: Primary abstract; task-identity taxonomy.</w:t>
       </w:r>
     </w:p>
     <w:p>
-      <w:bookmarkStart w:id="5" w:name="reference_5"/>
+      <w:bookmarkStart w:id="4" w:name="reference_4"/>
       <w:pPr>
         <w:keepNext/>
         <w:spacing w:before="80" w:after="40"/>
         <w:ind w:left="454" w:hanging="454"/>
       </w:pPr>
-      <w:bookmarkEnd w:id="5"/>
-      <w:r>
-        <w:t xml:space="preserve">[5] Lopez-Paz, D., and Ranzato, M. (2017). </w:t>
+      <w:bookmarkEnd w:id="4"/>
+      <w:r>
+        <w:t xml:space="preserve">[4] De Lange, M., et al. (2022). </w:t>
       </w:r>
       <w:r>
         <w:rPr>
           <w:i/>
         </w:rPr>
-        <w:t xml:space="preserve">Gradient Episodic Memory for Continual Learning. </w:t>
-      </w:r>
-      <w:r>
-        <w:t xml:space="preserve">NeurIPS 30. </w:t>
+        <w:t xml:space="preserve">A Continual Learning Survey: Defying Forgetting in Classification Tasks. </w:t>
+      </w:r>
+      <w:r>
+        <w:t xml:space="preserve">IEEE TPAMI 44(7), 3366–3385; online 2021. </w:t>
       </w:r>
       <w:hyperlink r:id="rId15" w:history="1">
         <w:r>
@@ -11662,28 +11630,28 @@
           <w:color w:val="536579"/>
           <w:sz w:val="17"/>
         </w:rPr>
-        <w:t>Access: Primary paper and metric definitions.</w:t>
+        <w:t>Access: Primary survey abstract and relevant evaluation discussion.</w:t>
       </w:r>
     </w:p>
     <w:p>
-      <w:bookmarkStart w:id="6" w:name="reference_6"/>
+      <w:bookmarkStart w:id="5" w:name="reference_5"/>
       <w:pPr>
         <w:keepNext/>
         <w:spacing w:before="80" w:after="40"/>
         <w:ind w:left="454" w:hanging="454"/>
       </w:pPr>
-      <w:bookmarkEnd w:id="6"/>
-      <w:r>
-        <w:t xml:space="preserve">[6] Hu, E. J., et al. (2022). </w:t>
+      <w:bookmarkEnd w:id="5"/>
+      <w:r>
+        <w:t xml:space="preserve">[5] Lopez-Paz, D., and Ranzato, M. (2017). </w:t>
       </w:r>
       <w:r>
         <w:rPr>
           <w:i/>
         </w:rPr>
-        <w:t xml:space="preserve">LoRA: Low-Rank Adaptation of Large Language Models. </w:t>
-      </w:r>
-      <w:r>
-        <w:t xml:space="preserve">ICLR 2022; initial preprint 2021. </w:t>
+        <w:t xml:space="preserve">Gradient Episodic Memory for Continual Learning. </w:t>
+      </w:r>
+      <w:r>
+        <w:t xml:space="preserve">NeurIPS 30. </w:t>
       </w:r>
       <w:hyperlink r:id="rId16" w:history="1">
         <w:r>
@@ -11705,28 +11673,28 @@
           <w:color w:val="536579"/>
           <w:sz w:val="17"/>
         </w:rPr>
-        <w:t>Access: Primary paper record and low-rank parameterization.</w:t>
+        <w:t>Access: Primary paper and metric definitions.</w:t>
       </w:r>
     </w:p>
     <w:p>
-      <w:bookmarkStart w:id="7" w:name="reference_7"/>
+      <w:bookmarkStart w:id="6" w:name="reference_6"/>
       <w:pPr>
         <w:keepNext/>
         <w:spacing w:before="80" w:after="40"/>
         <w:ind w:left="454" w:hanging="454"/>
       </w:pPr>
-      <w:bookmarkEnd w:id="7"/>
-      <w:r>
-        <w:t xml:space="preserve">[7] Aghajanyan, A., Zettlemoyer, L., and Gupta, S. (2021). </w:t>
+      <w:bookmarkEnd w:id="6"/>
+      <w:r>
+        <w:t xml:space="preserve">[6] Hu, E. J., et al. (2022). </w:t>
       </w:r>
       <w:r>
         <w:rPr>
           <w:i/>
         </w:rPr>
-        <w:t xml:space="preserve">Intrinsic Dimensionality Explains the Effectiveness of Language Model Fine-Tuning. </w:t>
-      </w:r>
-      <w:r>
-        <w:t xml:space="preserve">ACL-IJCNLP 2021. </w:t>
+        <w:t xml:space="preserve">LoRA: Low-Rank Adaptation of Large Language Models. </w:t>
+      </w:r>
+      <w:r>
+        <w:t xml:space="preserve">ICLR 2022; initial preprint 2021. </w:t>
       </w:r>
       <w:hyperlink r:id="rId17" w:history="1">
         <w:r>
@@ -11748,28 +11716,28 @@
           <w:color w:val="536579"/>
           <w:sz w:val="17"/>
         </w:rPr>
-        <w:t>Access: Primary abstract; contextual motivation.</w:t>
+        <w:t>Access: Primary paper record and low-rank parameterization.</w:t>
       </w:r>
     </w:p>
     <w:p>
-      <w:bookmarkStart w:id="8" w:name="reference_8"/>
+      <w:bookmarkStart w:id="7" w:name="reference_7"/>
       <w:pPr>
         <w:keepNext/>
         <w:spacing w:before="80" w:after="40"/>
         <w:ind w:left="454" w:hanging="454"/>
       </w:pPr>
-      <w:bookmarkEnd w:id="8"/>
-      <w:r>
-        <w:t xml:space="preserve">[8] Biderman, D., et al. (2024). </w:t>
+      <w:bookmarkEnd w:id="7"/>
+      <w:r>
+        <w:t xml:space="preserve">[7] Aghajanyan, A., Zettlemoyer, L., and Gupta, S. (2021). </w:t>
       </w:r>
       <w:r>
         <w:rPr>
           <w:i/>
         </w:rPr>
-        <w:t xml:space="preserve">LoRA Learns Less and Forgets Less. </w:t>
-      </w:r>
-      <w:r>
-        <w:t xml:space="preserve">Transactions on Machine Learning Research. </w:t>
+        <w:t xml:space="preserve">Intrinsic Dimensionality Explains the Effectiveness of Language Model Fine-Tuning. </w:t>
+      </w:r>
+      <w:r>
+        <w:t xml:space="preserve">ACL-IJCNLP 2021. </w:t>
       </w:r>
       <w:hyperlink r:id="rId18" w:history="1">
         <w:r>
@@ -11791,28 +11759,28 @@
           <w:color w:val="536579"/>
           <w:sz w:val="17"/>
         </w:rPr>
-        <w:t>Access: Targeted full text: Sections 3–4 and 6, Appendices A–B.</w:t>
+        <w:t>Access: Primary abstract; contextual motivation.</w:t>
       </w:r>
     </w:p>
     <w:p>
-      <w:bookmarkStart w:id="9" w:name="reference_9"/>
+      <w:bookmarkStart w:id="8" w:name="reference_8"/>
       <w:pPr>
         <w:keepNext/>
         <w:spacing w:before="80" w:after="40"/>
         <w:ind w:left="454" w:hanging="454"/>
       </w:pPr>
-      <w:bookmarkEnd w:id="9"/>
-      <w:r>
-        <w:t xml:space="preserve">[9] Shuttleworth, R., Andreas, J., Torralba, A., and Sharma, P. (2025). </w:t>
+      <w:bookmarkEnd w:id="8"/>
+      <w:r>
+        <w:t xml:space="preserve">[8] Biderman, D., et al. (2024). </w:t>
       </w:r>
       <w:r>
         <w:rPr>
           <w:i/>
         </w:rPr>
-        <w:t xml:space="preserve">LoRA vs Full Fine-tuning: An Illusion of Equivalence. </w:t>
-      </w:r>
-      <w:r>
-        <w:t xml:space="preserve">NeurIPS 38; initial preprint 2024. </w:t>
+        <w:t xml:space="preserve">LoRA Learns Less and Forgets Less. </w:t>
+      </w:r>
+      <w:r>
+        <w:t xml:space="preserve">Transactions on Machine Learning Research. </w:t>
       </w:r>
       <w:hyperlink r:id="rId19" w:history="1">
         <w:r>
@@ -11834,28 +11802,28 @@
           <w:color w:val="536579"/>
           <w:sz w:val="17"/>
         </w:rPr>
-        <w:t>Access: Targeted full text: Algorithm 1, spectral/forgetting/intervention/continual-learning sections and appendices. Venue independently checked in NeurIPS proceedings.</w:t>
+        <w:t>Access: Targeted full text: Sections 3–4 and 6, Appendices A–B.</w:t>
       </w:r>
     </w:p>
     <w:p>
-      <w:bookmarkStart w:id="10" w:name="reference_10"/>
+      <w:bookmarkStart w:id="9" w:name="reference_9"/>
       <w:pPr>
         <w:keepNext/>
         <w:spacing w:before="80" w:after="40"/>
         <w:ind w:left="454" w:hanging="454"/>
       </w:pPr>
-      <w:bookmarkEnd w:id="10"/>
-      <w:r>
-        <w:t xml:space="preserve">[10] Lun, D. C. X., and Ming, L. T. (2026). </w:t>
+      <w:bookmarkEnd w:id="9"/>
+      <w:r>
+        <w:t xml:space="preserve">[9] Shuttleworth, R., Andreas, J., Torralba, A., and Sharma, P. (2025). </w:t>
       </w:r>
       <w:r>
         <w:rPr>
           <w:i/>
         </w:rPr>
-        <w:t xml:space="preserve">H-LoRA: Rethinking Rank Selection for Controllable Knowledge Retention in Edge AI. </w:t>
-      </w:r>
-      <w:r>
-        <w:t xml:space="preserve">Computers, Materials &amp; Continua 88(1), article 87. </w:t>
+        <w:t xml:space="preserve">LoRA vs Full Fine-tuning: An Illusion of Equivalence. </w:t>
+      </w:r>
+      <w:r>
+        <w:t xml:space="preserve">NeurIPS 38; initial preprint 2024. </w:t>
       </w:r>
       <w:hyperlink r:id="rId20" w:history="1">
         <w:r>
@@ -11877,28 +11845,28 @@
           <w:color w:val="536579"/>
           <w:sz w:val="17"/>
         </w:rPr>
-        <w:t>Access: Targeted full text: parameterization, compact-model evaluation, rank heuristic and limitations. DOI 10.32604/cmc.2026.080068.</w:t>
+        <w:t>Access: Targeted full text: Algorithm 1, spectral/forgetting/intervention/continual-learning sections and appendices. Venue independently checked in NeurIPS proceedings.</w:t>
       </w:r>
     </w:p>
     <w:p>
-      <w:bookmarkStart w:id="11" w:name="reference_11"/>
+      <w:bookmarkStart w:id="10" w:name="reference_10"/>
       <w:pPr>
         <w:keepNext/>
         <w:spacing w:before="80" w:after="40"/>
         <w:ind w:left="454" w:hanging="454"/>
       </w:pPr>
-      <w:bookmarkEnd w:id="11"/>
-      <w:r>
-        <w:t xml:space="preserve">[11] Rathore, D., Kumar, V., Bansal, C., and Moitra, A. (2025). </w:t>
+      <w:bookmarkEnd w:id="10"/>
+      <w:r>
+        <w:t xml:space="preserve">[10] Lun, D. C. X., and Ming, L. T. (2026). </w:t>
       </w:r>
       <w:r>
         <w:rPr>
           <w:i/>
         </w:rPr>
-        <w:t xml:space="preserve">How Much is Too Much? Exploring LoRA Rank Trade-offs for Retaining Knowledge and Domain Robustness. </w:t>
-      </w:r>
-      <w:r>
-        <w:t xml:space="preserve">Findings of IJCNLP-AACL, 1003–1013. </w:t>
+        <w:t xml:space="preserve">H-LoRA: Rethinking Rank Selection for Controllable Knowledge Retention in Edge AI. </w:t>
+      </w:r>
+      <w:r>
+        <w:t xml:space="preserve">Computers, Materials &amp; Continua 88(1), article 87. </w:t>
       </w:r>
       <w:hyperlink r:id="rId21" w:history="1">
         <w:r>
@@ -11920,28 +11888,28 @@
           <w:color w:val="536579"/>
           <w:sz w:val="17"/>
         </w:rPr>
-        <w:t>Access: Targeted full text: model/task/rank setup and update-norm analysis.</w:t>
+        <w:t>Access: Targeted full text: parameterization, compact-model evaluation, rank heuristic and limitations. DOI 10.32604/cmc.2026.080068.</w:t>
       </w:r>
     </w:p>
     <w:p>
-      <w:bookmarkStart w:id="12" w:name="reference_12"/>
+      <w:bookmarkStart w:id="11" w:name="reference_11"/>
       <w:pPr>
         <w:keepNext/>
         <w:spacing w:before="80" w:after="40"/>
         <w:ind w:left="454" w:hanging="454"/>
       </w:pPr>
-      <w:bookmarkEnd w:id="12"/>
-      <w:r>
-        <w:t xml:space="preserve">[12] Patil, H. V., Sanam, V., and Atre, M. P. (2025). </w:t>
+      <w:bookmarkEnd w:id="11"/>
+      <w:r>
+        <w:t xml:space="preserve">[11] Rathore, D., Kumar, V., Bansal, C., and Moitra, A. (2025). </w:t>
       </w:r>
       <w:r>
         <w:rPr>
           <w:i/>
         </w:rPr>
-        <w:t xml:space="preserve">Stacked LoRA: Isolated Low-Rank Adaptation for Lifelong Knowledge Management. </w:t>
-      </w:r>
-      <w:r>
-        <w:t xml:space="preserve">IJCNLP-AACL Student Research Workshop, 36–46. </w:t>
+        <w:t xml:space="preserve">How Much is Too Much? Exploring LoRA Rank Trade-offs for Retaining Knowledge and Domain Robustness. </w:t>
+      </w:r>
+      <w:r>
+        <w:t xml:space="preserve">Findings of IJCNLP-AACL, 1003–1013. </w:t>
       </w:r>
       <w:hyperlink r:id="rId22" w:history="1">
         <w:r>
@@ -11963,28 +11931,28 @@
           <w:color w:val="536579"/>
           <w:sz w:val="17"/>
         </w:rPr>
-        <w:t>Access: Targeted full text: Sections 3–4, Llama-3.2-1B setting, task-specific activation and estimated timings.</w:t>
+        <w:t>Access: Targeted full text: model/task/rank setup and update-norm analysis.</w:t>
       </w:r>
     </w:p>
     <w:p>
-      <w:bookmarkStart w:id="13" w:name="reference_13"/>
+      <w:bookmarkStart w:id="12" w:name="reference_12"/>
       <w:pPr>
         <w:keepNext/>
         <w:spacing w:before="80" w:after="40"/>
         <w:ind w:left="454" w:hanging="454"/>
       </w:pPr>
-      <w:bookmarkEnd w:id="13"/>
-      <w:r>
-        <w:t xml:space="preserve">[13] Narula, A., Sharma, A., Jasuja, D., and Dhawan, A. (2026). </w:t>
+      <w:bookmarkEnd w:id="12"/>
+      <w:r>
+        <w:t xml:space="preserve">[12] Patil, H. V., Sanam, V., and Atre, M. P. (2025). </w:t>
       </w:r>
       <w:r>
         <w:rPr>
           <w:i/>
         </w:rPr>
-        <w:t xml:space="preserve">Capacity-Gated Forgetting in LoRA Fine-Tuning: Rank, Proximity, and Endogenous Replay in Medical LLMs. </w:t>
-      </w:r>
-      <w:r>
-        <w:t xml:space="preserve">CTB workshop at ICML 2026, as labeled in indexed manuscript. </w:t>
+        <w:t xml:space="preserve">Stacked LoRA: Isolated Low-Rank Adaptation for Lifelong Knowledge Management. </w:t>
+      </w:r>
+      <w:r>
+        <w:t xml:space="preserve">IJCNLP-AACL Student Research Workshop, 36–46. </w:t>
       </w:r>
       <w:hyperlink r:id="rId23" w:history="1">
         <w:r>
@@ -12006,28 +11974,28 @@
           <w:color w:val="536579"/>
           <w:sz w:val="17"/>
         </w:rPr>
-        <w:t>Access: LIMITED: indexed primary PDF text. Direct delivery browser-challenged. Numerical examples and formal withdrawal status not independently certified.</w:t>
+        <w:t>Access: Targeted full text: Sections 3–4, Llama-3.2-1B setting, task-specific activation and estimated timings.</w:t>
       </w:r>
     </w:p>
     <w:p>
-      <w:bookmarkStart w:id="14" w:name="reference_14"/>
+      <w:bookmarkStart w:id="13" w:name="reference_13"/>
       <w:pPr>
         <w:keepNext/>
         <w:spacing w:before="80" w:after="40"/>
         <w:ind w:left="454" w:hanging="454"/>
       </w:pPr>
-      <w:bookmarkEnd w:id="14"/>
-      <w:r>
-        <w:t xml:space="preserve">[14] Kalajdzievski, D. (2023). </w:t>
+      <w:bookmarkEnd w:id="13"/>
+      <w:r>
+        <w:t xml:space="preserve">[13] Narula, A., Sharma, A., Jasuja, D., and Dhawan, A. (2026). </w:t>
       </w:r>
       <w:r>
         <w:rPr>
           <w:i/>
         </w:rPr>
-        <w:t xml:space="preserve">A Rank Stabilization Scaling Factor for Fine-Tuning with LoRA. </w:t>
-      </w:r>
-      <w:r>
-        <w:t xml:space="preserve">arXiv:2312.03732v1. </w:t>
+        <w:t xml:space="preserve">Capacity-Gated Forgetting in LoRA Fine-Tuning: Rank, Proximity, and Endogenous Replay in Medical LLMs. </w:t>
+      </w:r>
+      <w:r>
+        <w:t xml:space="preserve">CTB workshop at ICML 2026, as labeled in indexed manuscript. </w:t>
       </w:r>
       <w:hyperlink r:id="rId24" w:history="1">
         <w:r>
@@ -12049,28 +12017,28 @@
           <w:color w:val="536579"/>
           <w:sz w:val="17"/>
         </w:rPr>
-        <w:t>Access: Primary abstract and scaling result; theoretical assumptions are not an exact-suite guarantee.</w:t>
+        <w:t>Access: LIMITED: indexed primary PDF text. Direct delivery browser-challenged. Numerical examples and formal withdrawal status not independently certified.</w:t>
       </w:r>
     </w:p>
     <w:p>
-      <w:bookmarkStart w:id="15" w:name="reference_15"/>
+      <w:bookmarkStart w:id="14" w:name="reference_14"/>
       <w:pPr>
         <w:keepNext/>
         <w:spacing w:before="80" w:after="40"/>
         <w:ind w:left="454" w:hanging="454"/>
       </w:pPr>
-      <w:bookmarkEnd w:id="15"/>
-      <w:r>
-        <w:t xml:space="preserve">[15] Hayou, S., Ghosh, N., and Yu, B. (2024). </w:t>
+      <w:bookmarkEnd w:id="14"/>
+      <w:r>
+        <w:t xml:space="preserve">[14] Kalajdzievski, D. (2023). </w:t>
       </w:r>
       <w:r>
         <w:rPr>
           <w:i/>
         </w:rPr>
-        <w:t xml:space="preserve">LoRA+: Efficient Low Rank Adaptation of Large Models. </w:t>
-      </w:r>
-      <w:r>
-        <w:t xml:space="preserve">ICML, PMLR 235, 17783–17806. </w:t>
+        <w:t xml:space="preserve">A Rank Stabilization Scaling Factor for Fine-Tuning with LoRA. </w:t>
+      </w:r>
+      <w:r>
+        <w:t xml:space="preserve">arXiv:2312.03732v1. </w:t>
       </w:r>
       <w:hyperlink r:id="rId25" w:history="1">
         <w:r>
@@ -12092,28 +12060,28 @@
           <w:color w:val="536579"/>
           <w:sz w:val="17"/>
         </w:rPr>
-        <w:t>Access: Primary abstract and factor-specific learning-rate method.</w:t>
+        <w:t>Access: Primary abstract and scaling result; theoretical assumptions are not an exact-suite guarantee.</w:t>
       </w:r>
     </w:p>
     <w:p>
-      <w:bookmarkStart w:id="16" w:name="reference_16"/>
+      <w:bookmarkStart w:id="15" w:name="reference_15"/>
       <w:pPr>
         <w:keepNext/>
         <w:spacing w:before="80" w:after="40"/>
         <w:ind w:left="454" w:hanging="454"/>
       </w:pPr>
-      <w:bookmarkEnd w:id="16"/>
-      <w:r>
-        <w:t xml:space="preserve">[16] Hayou, S., Ghosh, N., and Yu, B. (2024). </w:t>
+      <w:bookmarkEnd w:id="15"/>
+      <w:r>
+        <w:t xml:space="preserve">[15] Hayou, S., Ghosh, N., and Yu, B. (2024). </w:t>
       </w:r>
       <w:r>
         <w:rPr>
           <w:i/>
         </w:rPr>
-        <w:t xml:space="preserve">The Impact of Initialization on LoRA Finetuning Dynamics. </w:t>
-      </w:r>
-      <w:r>
-        <w:t xml:space="preserve">arXiv:2406.08447. </w:t>
+        <w:t xml:space="preserve">LoRA+: Efficient Low Rank Adaptation of Large Models. </w:t>
+      </w:r>
+      <w:r>
+        <w:t xml:space="preserve">ICML, PMLR 235, 17783–17806. </w:t>
       </w:r>
       <w:hyperlink r:id="rId26" w:history="1">
         <w:r>
@@ -12135,28 +12103,28 @@
           <w:color w:val="536579"/>
           <w:sz w:val="17"/>
         </w:rPr>
-        <w:t>Access: Primary abstract; initialization and LR asymmetry.</w:t>
+        <w:t>Access: Primary abstract and factor-specific learning-rate method.</w:t>
       </w:r>
     </w:p>
     <w:p>
-      <w:bookmarkStart w:id="17" w:name="reference_17"/>
+      <w:bookmarkStart w:id="16" w:name="reference_16"/>
       <w:pPr>
         <w:keepNext/>
         <w:spacing w:before="80" w:after="40"/>
         <w:ind w:left="454" w:hanging="454"/>
       </w:pPr>
-      <w:bookmarkEnd w:id="17"/>
-      <w:r>
-        <w:t xml:space="preserve">[17] Zhang, Q., et al. (2023). </w:t>
+      <w:bookmarkEnd w:id="16"/>
+      <w:r>
+        <w:t xml:space="preserve">[16] Hayou, S., Ghosh, N., and Yu, B. (2024). </w:t>
       </w:r>
       <w:r>
         <w:rPr>
           <w:i/>
         </w:rPr>
-        <w:t xml:space="preserve">AdaLoRA: Adaptive Budget Allocation for Parameter-Efficient Fine-Tuning. </w:t>
-      </w:r>
-      <w:r>
-        <w:t xml:space="preserve">ICLR 2023. </w:t>
+        <w:t xml:space="preserve">The Impact of Initialization on LoRA Finetuning Dynamics. </w:t>
+      </w:r>
+      <w:r>
+        <w:t xml:space="preserve">arXiv:2406.08447. </w:t>
       </w:r>
       <w:hyperlink r:id="rId27" w:history="1">
         <w:r>
@@ -12178,28 +12146,28 @@
           <w:color w:val="536579"/>
           <w:sz w:val="17"/>
         </w:rPr>
-        <w:t>Access: Primary abstract and adaptive-budget method.</w:t>
+        <w:t>Access: Primary abstract; initialization and LR asymmetry.</w:t>
       </w:r>
     </w:p>
     <w:p>
-      <w:bookmarkStart w:id="18" w:name="reference_18"/>
+      <w:bookmarkStart w:id="17" w:name="reference_17"/>
       <w:pPr>
         <w:keepNext/>
         <w:spacing w:before="80" w:after="40"/>
         <w:ind w:left="454" w:hanging="454"/>
       </w:pPr>
-      <w:bookmarkEnd w:id="18"/>
-      <w:r>
-        <w:t xml:space="preserve">[18] Liu, S.-Y., et al. (2024). </w:t>
+      <w:bookmarkEnd w:id="17"/>
+      <w:r>
+        <w:t xml:space="preserve">[17] Zhang, Q., et al. (2023). </w:t>
       </w:r>
       <w:r>
         <w:rPr>
           <w:i/>
         </w:rPr>
-        <w:t xml:space="preserve">DoRA: Weight-Decomposed Low-Rank Adaptation. </w:t>
-      </w:r>
-      <w:r>
-        <w:t xml:space="preserve">ICML 2024. </w:t>
+        <w:t xml:space="preserve">AdaLoRA: Adaptive Budget Allocation for Parameter-Efficient Fine-Tuning. </w:t>
+      </w:r>
+      <w:r>
+        <w:t xml:space="preserve">ICLR 2023. </w:t>
       </w:r>
       <w:hyperlink r:id="rId28" w:history="1">
         <w:r>
@@ -12221,28 +12189,28 @@
           <w:color w:val="536579"/>
           <w:sz w:val="17"/>
         </w:rPr>
-        <w:t>Access: Primary abstract and magnitude/direction decomposition.</w:t>
+        <w:t>Access: Primary abstract and adaptive-budget method.</w:t>
       </w:r>
     </w:p>
     <w:p>
-      <w:bookmarkStart w:id="19" w:name="reference_19"/>
+      <w:bookmarkStart w:id="18" w:name="reference_18"/>
       <w:pPr>
         <w:keepNext/>
         <w:spacing w:before="80" w:after="40"/>
         <w:ind w:left="454" w:hanging="454"/>
       </w:pPr>
-      <w:bookmarkEnd w:id="19"/>
-      <w:r>
-        <w:t xml:space="preserve">[19] Meng, F., Wang, Z., and Zhang, M. (2024; revision 2025). </w:t>
+      <w:bookmarkEnd w:id="18"/>
+      <w:r>
+        <w:t xml:space="preserve">[18] Liu, S.-Y., et al. (2024). </w:t>
       </w:r>
       <w:r>
         <w:rPr>
           <w:i/>
         </w:rPr>
-        <w:t xml:space="preserve">PiSSA: Principal Singular Values and Singular Vectors Adaptation of Large Language Models. </w:t>
-      </w:r>
-      <w:r>
-        <w:t xml:space="preserve">arXiv:2404.02948v4. </w:t>
+        <w:t xml:space="preserve">DoRA: Weight-Decomposed Low-Rank Adaptation. </w:t>
+      </w:r>
+      <w:r>
+        <w:t xml:space="preserve">ICML 2024. </w:t>
       </w:r>
       <w:hyperlink r:id="rId29" w:history="1">
         <w:r>
@@ -12264,28 +12232,28 @@
           <w:color w:val="536579"/>
           <w:sz w:val="17"/>
         </w:rPr>
-        <w:t>Access: Primary paper record and spectral-initialization method description.</w:t>
+        <w:t>Access: Primary abstract and magnitude/direction decomposition.</w:t>
       </w:r>
     </w:p>
     <w:p>
-      <w:bookmarkStart w:id="20" w:name="reference_20"/>
+      <w:bookmarkStart w:id="19" w:name="reference_19"/>
       <w:pPr>
         <w:keepNext/>
         <w:spacing w:before="80" w:after="40"/>
         <w:ind w:left="454" w:hanging="454"/>
       </w:pPr>
-      <w:bookmarkEnd w:id="20"/>
-      <w:r>
-        <w:t xml:space="preserve">[20] Dettmers, T., Pagnoni, A., Holtzman, A., and Zettlemoyer, L. (2023). </w:t>
+      <w:bookmarkEnd w:id="19"/>
+      <w:r>
+        <w:t xml:space="preserve">[19] Meng, F., Wang, Z., and Zhang, M. (2024; revision 2025). </w:t>
       </w:r>
       <w:r>
         <w:rPr>
           <w:i/>
         </w:rPr>
-        <w:t xml:space="preserve">QLoRA: Efficient Finetuning of Quantized LLMs. </w:t>
-      </w:r>
-      <w:r>
-        <w:t xml:space="preserve">NeurIPS 36. </w:t>
+        <w:t xml:space="preserve">PiSSA: Principal Singular Values and Singular Vectors Adaptation of Large Language Models. </w:t>
+      </w:r>
+      <w:r>
+        <w:t xml:space="preserve">arXiv:2404.02948v4. </w:t>
       </w:r>
       <w:hyperlink r:id="rId30" w:history="1">
         <w:r>
@@ -12307,28 +12275,28 @@
           <w:color w:val="536579"/>
           <w:sz w:val="17"/>
         </w:rPr>
-        <w:t>Access: Primary abstract and quantized-backbone method; no exact-protocol LR validation.</w:t>
+        <w:t>Access: Primary paper record and spectral-initialization method description.</w:t>
       </w:r>
     </w:p>
     <w:p>
-      <w:bookmarkStart w:id="21" w:name="reference_21"/>
+      <w:bookmarkStart w:id="20" w:name="reference_20"/>
       <w:pPr>
         <w:keepNext/>
         <w:spacing w:before="80" w:after="40"/>
         <w:ind w:left="454" w:hanging="454"/>
       </w:pPr>
-      <w:bookmarkEnd w:id="21"/>
-      <w:r>
-        <w:t xml:space="preserve">[21] Wang, X., et al. (2023). </w:t>
+      <w:bookmarkEnd w:id="20"/>
+      <w:r>
+        <w:t xml:space="preserve">[20] Dettmers, T., Pagnoni, A., Holtzman, A., and Zettlemoyer, L. (2023). </w:t>
       </w:r>
       <w:r>
         <w:rPr>
           <w:i/>
         </w:rPr>
-        <w:t xml:space="preserve">Orthogonal Subspace Learning for Language Model Continual Learning. </w:t>
-      </w:r>
-      <w:r>
-        <w:t xml:space="preserve">Findings of EMNLP, 10658–10671. </w:t>
+        <w:t xml:space="preserve">QLoRA: Efficient Finetuning of Quantized LLMs. </w:t>
+      </w:r>
+      <w:r>
+        <w:t xml:space="preserve">NeurIPS 36. </w:t>
       </w:r>
       <w:hyperlink r:id="rId31" w:history="1">
         <w:r>
@@ -12350,28 +12318,28 @@
           <w:color w:val="536579"/>
           <w:sz w:val="17"/>
         </w:rPr>
-        <w:t>Access: Primary abstract and O-LoRA method.</w:t>
+        <w:t>Access: Primary abstract and quantized-backbone method; no exact-protocol LR validation.</w:t>
       </w:r>
     </w:p>
     <w:p>
-      <w:bookmarkStart w:id="22" w:name="reference_22"/>
+      <w:bookmarkStart w:id="21" w:name="reference_21"/>
       <w:pPr>
         <w:keepNext/>
         <w:spacing w:before="80" w:after="40"/>
         <w:ind w:left="454" w:hanging="454"/>
       </w:pPr>
-      <w:bookmarkEnd w:id="22"/>
-      <w:r>
-        <w:t xml:space="preserve">[22] Lu, Y., Qian, B., Yuan, C., Jiang, H., and Wang, X. (2025). </w:t>
+      <w:bookmarkEnd w:id="21"/>
+      <w:r>
+        <w:t xml:space="preserve">[21] Wang, X., et al. (2023). </w:t>
       </w:r>
       <w:r>
         <w:rPr>
           <w:i/>
         </w:rPr>
-        <w:t xml:space="preserve">Controlled Low-Rank Adaptation with Subspace Regularization for Continued Training on Large Language Models. </w:t>
-      </w:r>
-      <w:r>
-        <w:t xml:space="preserve">ACL, 19165–19181. </w:t>
+        <w:t xml:space="preserve">Orthogonal Subspace Learning for Language Model Continual Learning. </w:t>
+      </w:r>
+      <w:r>
+        <w:t xml:space="preserve">Findings of EMNLP, 10658–10671. </w:t>
       </w:r>
       <w:hyperlink r:id="rId32" w:history="1">
         <w:r>
@@ -12393,28 +12361,28 @@
           <w:color w:val="536579"/>
           <w:sz w:val="17"/>
         </w:rPr>
-        <w:t>Access: Primary abstract and CLoRA method.</w:t>
+        <w:t>Access: Primary abstract and O-LoRA method.</w:t>
       </w:r>
     </w:p>
     <w:p>
-      <w:bookmarkStart w:id="23" w:name="reference_23"/>
+      <w:bookmarkStart w:id="22" w:name="reference_22"/>
       <w:pPr>
         <w:keepNext/>
         <w:spacing w:before="80" w:after="40"/>
         <w:ind w:left="454" w:hanging="454"/>
       </w:pPr>
-      <w:bookmarkEnd w:id="23"/>
-      <w:r>
-        <w:t xml:space="preserve">[23] Yang, L., Liao, Y., Wang, Y., and Wang, Y. (2026). </w:t>
+      <w:bookmarkEnd w:id="22"/>
+      <w:r>
+        <w:t xml:space="preserve">[22] Lu, Y., Qian, B., Yuan, C., Jiang, H., and Wang, X. (2025). </w:t>
       </w:r>
       <w:r>
         <w:rPr>
           <w:i/>
         </w:rPr>
-        <w:t xml:space="preserve">SLoRA: Balancing Plasticity and Forgetting in Large Language Models for Continual Learning. </w:t>
-      </w:r>
-      <w:r>
-        <w:t xml:space="preserve">ACL, 5437–5454. </w:t>
+        <w:t xml:space="preserve">Controlled Low-Rank Adaptation with Subspace Regularization for Continued Training on Large Language Models. </w:t>
+      </w:r>
+      <w:r>
+        <w:t xml:space="preserve">ACL, 19165–19181. </w:t>
       </w:r>
       <w:hyperlink r:id="rId33" w:history="1">
         <w:r>
@@ -12436,28 +12404,28 @@
           <w:color w:val="536579"/>
           <w:sz w:val="17"/>
         </w:rPr>
-        <w:t>Access: Primary abstract and introduction; subspace denoising, distinct from Stacked LoRA.</w:t>
+        <w:t>Access: Primary abstract and CLoRA method.</w:t>
       </w:r>
     </w:p>
     <w:p>
-      <w:bookmarkStart w:id="24" w:name="reference_24"/>
+      <w:bookmarkStart w:id="23" w:name="reference_23"/>
       <w:pPr>
         <w:keepNext/>
         <w:spacing w:before="80" w:after="40"/>
         <w:ind w:left="454" w:hanging="454"/>
       </w:pPr>
-      <w:bookmarkEnd w:id="24"/>
-      <w:r>
-        <w:t xml:space="preserve">[24] Huang, W., Cheng, A., and Wang, Y. (2025). </w:t>
+      <w:bookmarkEnd w:id="23"/>
+      <w:r>
+        <w:t xml:space="preserve">[23] Yang, L., Liao, Y., Wang, Y., and Wang, Y. (2026). </w:t>
       </w:r>
       <w:r>
         <w:rPr>
           <w:i/>
         </w:rPr>
-        <w:t xml:space="preserve">Mitigating Catastrophic Forgetting in Large Language Models with Forgetting-aware Pruning. </w:t>
-      </w:r>
-      <w:r>
-        <w:t xml:space="preserve">EMNLP, 21842–21856. </w:t>
+        <w:t xml:space="preserve">SLoRA: Balancing Plasticity and Forgetting in Large Language Models for Continual Learning. </w:t>
+      </w:r>
+      <w:r>
+        <w:t xml:space="preserve">ACL, 5437–5454. </w:t>
       </w:r>
       <w:hyperlink r:id="rId34" w:history="1">
         <w:r>
@@ -12479,28 +12447,28 @@
           <w:color w:val="536579"/>
           <w:sz w:val="17"/>
         </w:rPr>
-        <w:t>Access: Primary abstract and pruning criterion. No improvement percentages transferred to this project.</w:t>
+        <w:t>Access: Primary abstract and introduction; subspace denoising, distinct from Stacked LoRA.</w:t>
       </w:r>
     </w:p>
     <w:p>
-      <w:bookmarkStart w:id="25" w:name="reference_25"/>
+      <w:bookmarkStart w:id="24" w:name="reference_24"/>
       <w:pPr>
         <w:keepNext/>
         <w:spacing w:before="80" w:after="40"/>
         <w:ind w:left="454" w:hanging="454"/>
       </w:pPr>
-      <w:bookmarkEnd w:id="25"/>
-      <w:r>
-        <w:t xml:space="preserve">[25] Liang, Y.-S., and Li, W.-J. (2024). </w:t>
+      <w:bookmarkEnd w:id="24"/>
+      <w:r>
+        <w:t xml:space="preserve">[24] Huang, W., Cheng, A., and Wang, Y. (2025). </w:t>
       </w:r>
       <w:r>
         <w:rPr>
           <w:i/>
         </w:rPr>
-        <w:t xml:space="preserve">InfLoRA: Interference-Free Low-Rank Adaptation for Continual Learning. </w:t>
-      </w:r>
-      <w:r>
-        <w:t xml:space="preserve">CVPR 2024. </w:t>
+        <w:t xml:space="preserve">Mitigating Catastrophic Forgetting in Large Language Models with Forgetting-aware Pruning. </w:t>
+      </w:r>
+      <w:r>
+        <w:t xml:space="preserve">EMNLP, 21842–21856. </w:t>
       </w:r>
       <w:hyperlink r:id="rId35" w:history="1">
         <w:r>
@@ -12522,28 +12490,28 @@
           <w:color w:val="536579"/>
           <w:sz w:val="17"/>
         </w:rPr>
-        <w:t>Access: Primary abstract and vision continual-learning setting.</w:t>
+        <w:t>Access: Primary abstract and pruning criterion. No improvement percentages transferred to this project.</w:t>
       </w:r>
     </w:p>
     <w:p>
-      <w:bookmarkStart w:id="26" w:name="reference_26"/>
+      <w:bookmarkStart w:id="25" w:name="reference_25"/>
       <w:pPr>
         <w:keepNext/>
         <w:spacing w:before="80" w:after="40"/>
         <w:ind w:left="454" w:hanging="454"/>
       </w:pPr>
-      <w:bookmarkEnd w:id="26"/>
-      <w:r>
-        <w:t xml:space="preserve">[26] Wu, Y., et al. (2025). </w:t>
+      <w:bookmarkEnd w:id="25"/>
+      <w:r>
+        <w:t xml:space="preserve">[25] Liang, Y.-S., and Li, W.-J. (2024). </w:t>
       </w:r>
       <w:r>
         <w:rPr>
           <w:i/>
         </w:rPr>
-        <w:t xml:space="preserve">SD-LoRA: Scalable Decoupled Low-Rank Adaptation for Class Incremental Learning. </w:t>
-      </w:r>
-      <w:r>
-        <w:t xml:space="preserve">ICLR 2025. </w:t>
+        <w:t xml:space="preserve">InfLoRA: Interference-Free Low-Rank Adaptation for Continual Learning. </w:t>
+      </w:r>
+      <w:r>
+        <w:t xml:space="preserve">CVPR 2024. </w:t>
       </w:r>
       <w:hyperlink r:id="rId36" w:history="1">
         <w:r>
@@ -12565,28 +12533,28 @@
           <w:color w:val="536579"/>
           <w:sz w:val="17"/>
         </w:rPr>
-        <w:t>Access: Primary proceedings abstract; class-incremental setting.</w:t>
+        <w:t>Access: Primary abstract and vision continual-learning setting.</w:t>
       </w:r>
     </w:p>
     <w:p>
-      <w:bookmarkStart w:id="27" w:name="reference_27"/>
+      <w:bookmarkStart w:id="26" w:name="reference_26"/>
       <w:pPr>
         <w:keepNext/>
         <w:spacing w:before="80" w:after="40"/>
         <w:ind w:left="454" w:hanging="454"/>
       </w:pPr>
-      <w:bookmarkEnd w:id="27"/>
-      <w:r>
-        <w:t xml:space="preserve">[27] Wang, Y., et al. (2026). </w:t>
+      <w:bookmarkEnd w:id="26"/>
+      <w:r>
+        <w:t xml:space="preserve">[26] Wu, Y., et al. (2025). </w:t>
       </w:r>
       <w:r>
         <w:rPr>
           <w:i/>
         </w:rPr>
-        <w:t xml:space="preserve">Soft Orthogonal Low-Rank Adaptation for Knowledge Sharing in Large Language Model Continual Learning. </w:t>
-      </w:r>
-      <w:r>
-        <w:t xml:space="preserve">ACL 2026. </w:t>
+        <w:t xml:space="preserve">SD-LoRA: Scalable Decoupled Low-Rank Adaptation for Class Incremental Learning. </w:t>
+      </w:r>
+      <w:r>
+        <w:t xml:space="preserve">ICLR 2025. </w:t>
       </w:r>
       <w:hyperlink r:id="rId37" w:history="1">
         <w:r>
@@ -12608,25 +12576,25 @@
           <w:color w:val="536579"/>
           <w:sz w:val="17"/>
         </w:rPr>
-        <w:t>Access: Primary abstract; ASO-LoRA and task sharing.</w:t>
+        <w:t>Access: Primary proceedings abstract; class-incremental setting.</w:t>
       </w:r>
     </w:p>
     <w:p>
-      <w:bookmarkStart w:id="28" w:name="reference_28"/>
+      <w:bookmarkStart w:id="27" w:name="reference_27"/>
       <w:pPr>
         <w:keepNext/>
         <w:spacing w:before="80" w:after="40"/>
         <w:ind w:left="454" w:hanging="454"/>
       </w:pPr>
-      <w:bookmarkEnd w:id="28"/>
-      <w:r>
-        <w:t xml:space="preserve">[28] Liao, H., et al. (2026). </w:t>
+      <w:bookmarkEnd w:id="27"/>
+      <w:r>
+        <w:t xml:space="preserve">[27] Wang, Y., et al. (2026). </w:t>
       </w:r>
       <w:r>
         <w:rPr>
           <w:i/>
         </w:rPr>
-        <w:t xml:space="preserve">Spectral Disentanglement: Rank-Aware Task Adaptation for Rehearsal-free Continual Learning in LLMs. </w:t>
+        <w:t xml:space="preserve">Soft Orthogonal Low-Rank Adaptation for Knowledge Sharing in Large Language Model Continual Learning. </w:t>
       </w:r>
       <w:r>
         <w:t xml:space="preserve">ACL 2026. </w:t>
@@ -12651,28 +12619,28 @@
           <w:color w:val="536579"/>
           <w:sz w:val="17"/>
         </w:rPr>
-        <w:t>Access: Primary abstract and experimental setup; SpaRTA/SPARTA dual-branch method.</w:t>
+        <w:t>Access: Primary abstract; ASO-LoRA and task sharing.</w:t>
       </w:r>
     </w:p>
     <w:p>
-      <w:bookmarkStart w:id="29" w:name="reference_29"/>
+      <w:bookmarkStart w:id="28" w:name="reference_28"/>
       <w:pPr>
         <w:keepNext/>
         <w:spacing w:before="80" w:after="40"/>
         <w:ind w:left="454" w:hanging="454"/>
       </w:pPr>
-      <w:bookmarkEnd w:id="29"/>
-      <w:r>
-        <w:t xml:space="preserve">[29] Lu, H., Zhao, C., Xue, M., Yao, L., Moore, K., and Gong, D. (2026). </w:t>
+      <w:bookmarkEnd w:id="28"/>
+      <w:r>
+        <w:t xml:space="preserve">[28] Liao, H., et al. (2026). </w:t>
       </w:r>
       <w:r>
         <w:rPr>
           <w:i/>
         </w:rPr>
-        <w:t xml:space="preserve">Take Only What You Need: Rank Minimization as an Implicit Forgetting Regularizer in Continual Learning. </w:t>
-      </w:r>
-      <w:r>
-        <w:t xml:space="preserve">arXiv:2412.01004v9; authors report Findings of EMNLP 2026 acceptance. </w:t>
+        <w:t xml:space="preserve">Spectral Disentanglement: Rank-Aware Task Adaptation for Rehearsal-free Continual Learning in LLMs. </w:t>
+      </w:r>
+      <w:r>
+        <w:t xml:space="preserve">ACL 2026. </w:t>
       </w:r>
       <w:hyperlink r:id="rId39" w:history="1">
         <w:r>
@@ -12694,28 +12662,28 @@
           <w:color w:val="536579"/>
           <w:sz w:val="17"/>
         </w:rPr>
-        <w:t>Access: Targeted full text: rank/placement probes, CoDyRA, norm-matched probe and updated LLM setting. Earlier versions had another title.</w:t>
+        <w:t>Access: Primary abstract and experimental setup; SpaRTA/SPARTA dual-branch method.</w:t>
       </w:r>
     </w:p>
     <w:p>
-      <w:bookmarkStart w:id="30" w:name="reference_30"/>
+      <w:bookmarkStart w:id="29" w:name="reference_29"/>
       <w:pPr>
         <w:keepNext/>
         <w:spacing w:before="80" w:after="40"/>
         <w:ind w:left="454" w:hanging="454"/>
       </w:pPr>
-      <w:bookmarkEnd w:id="30"/>
-      <w:r>
-        <w:t xml:space="preserve">[30] Marchetta, T., Alessandroni, F., Breccia, A., Ingrosso, A., and Gerace, F. (2026). </w:t>
+      <w:bookmarkEnd w:id="29"/>
+      <w:r>
+        <w:t xml:space="preserve">[29] Lu, H., Zhao, C., Xue, M., Yao, L., Moore, K., and Gong, D. (2026). </w:t>
       </w:r>
       <w:r>
         <w:rPr>
           <w:i/>
         </w:rPr>
-        <w:t xml:space="preserve">A Dynamical Theory of LoRA in Continual Learning. </w:t>
-      </w:r>
-      <w:r>
-        <w:t xml:space="preserve">arXiv:2609.39367v1, 30 September; preprint. </w:t>
+        <w:t xml:space="preserve">Take Only What You Need: Rank Minimization as an Implicit Forgetting Regularizer in Continual Learning. </w:t>
+      </w:r>
+      <w:r>
+        <w:t xml:space="preserve">arXiv:2412.01004v9; authors report Findings of EMNLP 2026 acceptance. </w:t>
       </w:r>
       <w:hyperlink r:id="rId40" w:history="1">
         <w:r>
@@ -12737,28 +12705,28 @@
           <w:color w:val="536579"/>
           <w:sz w:val="17"/>
         </w:rPr>
-        <w:t>Access: Primary abstract and theoretical setting; two-task teacher–student model and sequential MNIST.</w:t>
+        <w:t>Access: Targeted full text: rank/placement probes, CoDyRA, norm-matched probe and updated LLM setting. Earlier versions had another title.</w:t>
       </w:r>
     </w:p>
     <w:p>
-      <w:bookmarkStart w:id="31" w:name="reference_31"/>
+      <w:bookmarkStart w:id="30" w:name="reference_30"/>
       <w:pPr>
         <w:keepNext/>
         <w:spacing w:before="80" w:after="40"/>
         <w:ind w:left="454" w:hanging="454"/>
       </w:pPr>
-      <w:bookmarkEnd w:id="31"/>
-      <w:r>
-        <w:t xml:space="preserve">[31] Chen, C., et al. (2026). </w:t>
+      <w:bookmarkEnd w:id="30"/>
+      <w:r>
+        <w:t xml:space="preserve">[30] Marchetta, T., Alessandroni, F., Breccia, A., Ingrosso, A., and Gerace, F. (2026). </w:t>
       </w:r>
       <w:r>
         <w:rPr>
           <w:i/>
         </w:rPr>
-        <w:t xml:space="preserve">Janus-LoRA: A Balanced Low-Rank Adaptation for Continual Learning. </w:t>
-      </w:r>
-      <w:r>
-        <w:t xml:space="preserve">arXiv:2605.28495; ICML 2026 listed on authors' project page. </w:t>
+        <w:t xml:space="preserve">A Dynamical Theory of LoRA in Continual Learning. </w:t>
+      </w:r>
+      <w:r>
+        <w:t xml:space="preserve">arXiv:2609.39367v1, 30 September; preprint. </w:t>
       </w:r>
       <w:hyperlink r:id="rId41" w:history="1">
         <w:r>
@@ -12780,28 +12748,28 @@
           <w:color w:val="536579"/>
           <w:sz w:val="17"/>
         </w:rPr>
-        <w:t>Access: Primary abstract and author project description; composite factor-update interference.</w:t>
+        <w:t>Access: Primary abstract and theoretical setting; two-task teacher–student model and sequential MNIST.</w:t>
       </w:r>
     </w:p>
     <w:p>
-      <w:bookmarkStart w:id="32" w:name="reference_32"/>
+      <w:bookmarkStart w:id="31" w:name="reference_31"/>
       <w:pPr>
         <w:keepNext/>
         <w:spacing w:before="80" w:after="40"/>
         <w:ind w:left="454" w:hanging="454"/>
       </w:pPr>
-      <w:bookmarkEnd w:id="32"/>
-      <w:r>
-        <w:t xml:space="preserve">[32] Lee, Y.-A., Ko, C.-Y., Chen, P.-Y., and Yeh, M.-Y. (2026). </w:t>
+      <w:bookmarkEnd w:id="31"/>
+      <w:r>
+        <w:t xml:space="preserve">[31] Chen, C., et al. (2026). </w:t>
       </w:r>
       <w:r>
         <w:rPr>
           <w:i/>
         </w:rPr>
-        <w:t xml:space="preserve">Learning Rate Matters: Vanilla LoRA May Suffice for LLM Fine-tuning. </w:t>
-      </w:r>
-      <w:r>
-        <w:t xml:space="preserve">arXiv:2602.04998v2; preprint. </w:t>
+        <w:t xml:space="preserve">Janus-LoRA: A Balanced Low-Rank Adaptation for Continual Learning. </w:t>
+      </w:r>
+      <w:r>
+        <w:t xml:space="preserve">arXiv:2605.28495; ICML 2026 listed on authors' project page. </w:t>
       </w:r>
       <w:hyperlink r:id="rId42" w:history="1">
         <w:r>
@@ -12823,28 +12791,28 @@
           <w:color w:val="536579"/>
           <w:sz w:val="17"/>
         </w:rPr>
-        <w:t>Access: Targeted full text: hyperparameter re-evaluation, LR/rank/batch discussion and small-model tables.</w:t>
+        <w:t>Access: Primary abstract and author project description; composite factor-update interference.</w:t>
       </w:r>
     </w:p>
     <w:p>
-      <w:bookmarkStart w:id="33" w:name="reference_33"/>
+      <w:bookmarkStart w:id="32" w:name="reference_32"/>
       <w:pPr>
         <w:keepNext/>
         <w:spacing w:before="80" w:after="40"/>
         <w:ind w:left="454" w:hanging="454"/>
       </w:pPr>
-      <w:bookmarkEnd w:id="33"/>
-      <w:r>
-        <w:t xml:space="preserve">[33] Tao, M., Feng, Y., and Zhao, D. (2023). </w:t>
+      <w:bookmarkEnd w:id="32"/>
+      <w:r>
+        <w:t xml:space="preserve">[32] Lee, Y.-A., Ko, C.-Y., Chen, P.-Y., and Yeh, M.-Y. (2026). </w:t>
       </w:r>
       <w:r>
         <w:rPr>
           <w:i/>
         </w:rPr>
-        <w:t xml:space="preserve">Can BERT Refrain from Forgetting on Sequential Tasks? A Probing Study. </w:t>
-      </w:r>
-      <w:r>
-        <w:t xml:space="preserve">ICLR 2023. </w:t>
+        <w:t xml:space="preserve">Learning Rate Matters: Vanilla LoRA May Suffice for LLM Fine-tuning. </w:t>
+      </w:r>
+      <w:r>
+        <w:t xml:space="preserve">arXiv:2602.04998v2; preprint. </w:t>
       </w:r>
       <w:hyperlink r:id="rId43" w:history="1">
         <w:r>
@@ -12866,28 +12834,28 @@
           <w:color w:val="536579"/>
           <w:sz w:val="17"/>
         </w:rPr>
-        <w:t>Access: Primary abstract and author code protocol; refitted linear probes.</w:t>
+        <w:t>Access: Targeted full text: hyperparameter re-evaluation, LR/rank/batch discussion and small-model tables.</w:t>
       </w:r>
     </w:p>
     <w:p>
-      <w:bookmarkStart w:id="34" w:name="reference_34"/>
+      <w:bookmarkStart w:id="33" w:name="reference_33"/>
       <w:pPr>
         <w:keepNext/>
         <w:spacing w:before="80" w:after="40"/>
         <w:ind w:left="454" w:hanging="454"/>
       </w:pPr>
-      <w:bookmarkEnd w:id="34"/>
-      <w:r>
-        <w:t xml:space="preserve">[34] Wang, X., et al. (2023). </w:t>
+      <w:bookmarkEnd w:id="33"/>
+      <w:r>
+        <w:t xml:space="preserve">[33] Tao, M., Feng, Y., and Zhao, D. (2023). </w:t>
       </w:r>
       <w:r>
         <w:rPr>
           <w:i/>
         </w:rPr>
-        <w:t xml:space="preserve">TRACE: A Comprehensive Benchmark for Continual Learning in Large Language Models. </w:t>
-      </w:r>
-      <w:r>
-        <w:t xml:space="preserve">arXiv:2310.06762. </w:t>
+        <w:t xml:space="preserve">Can BERT Refrain from Forgetting on Sequential Tasks? A Probing Study. </w:t>
+      </w:r>
+      <w:r>
+        <w:t xml:space="preserve">ICLR 2023. </w:t>
       </w:r>
       <w:hyperlink r:id="rId44" w:history="1">
         <w:r>
@@ -12909,28 +12877,28 @@
           <w:color w:val="536579"/>
           <w:sz w:val="17"/>
         </w:rPr>
-        <w:t>Access: Primary abstract; heterogeneous generative continual-learning benchmark.</w:t>
+        <w:t>Access: Primary abstract and author code protocol; refitted linear probes.</w:t>
       </w:r>
     </w:p>
     <w:p>
-      <w:bookmarkStart w:id="35" w:name="reference_35"/>
+      <w:bookmarkStart w:id="34" w:name="reference_34"/>
       <w:pPr>
         <w:keepNext/>
         <w:spacing w:before="80" w:after="40"/>
         <w:ind w:left="454" w:hanging="454"/>
       </w:pPr>
-      <w:bookmarkEnd w:id="35"/>
-      <w:r>
-        <w:t xml:space="preserve">[35] Wang, A., Singh, A., Michael, J., Hill, F., Levy, O., and Bowman, S. R. (2019). </w:t>
+      <w:bookmarkEnd w:id="34"/>
+      <w:r>
+        <w:t xml:space="preserve">[34] Wang, X., et al. (2023). </w:t>
       </w:r>
       <w:r>
         <w:rPr>
           <w:i/>
         </w:rPr>
-        <w:t xml:space="preserve">GLUE: A Multi-Task Benchmark and Analysis Platform for Natural Language Understanding. </w:t>
-      </w:r>
-      <w:r>
-        <w:t xml:space="preserve">ICLR 2019; initial preprint 2018. </w:t>
+        <w:t xml:space="preserve">TRACE: A Comprehensive Benchmark for Continual Learning in Large Language Models. </w:t>
+      </w:r>
+      <w:r>
+        <w:t xml:space="preserve">arXiv:2310.06762. </w:t>
       </w:r>
       <w:hyperlink r:id="rId45" w:history="1">
         <w:r>
@@ -12952,28 +12920,28 @@
           <w:color w:val="536579"/>
           <w:sz w:val="17"/>
         </w:rPr>
-        <w:t>Access: Primary benchmark description; distinguish standard GLUE from this small-data sequence.</w:t>
+        <w:t>Access: Primary abstract; heterogeneous generative continual-learning benchmark.</w:t>
       </w:r>
     </w:p>
     <w:p>
-      <w:bookmarkStart w:id="36" w:name="reference_36"/>
+      <w:bookmarkStart w:id="35" w:name="reference_35"/>
       <w:pPr>
         <w:keepNext/>
         <w:spacing w:before="80" w:after="40"/>
         <w:ind w:left="454" w:hanging="454"/>
       </w:pPr>
-      <w:bookmarkEnd w:id="36"/>
-      <w:r>
-        <w:t xml:space="preserve">[36] Williams, A., Nangia, N., and Bowman, S. R. (2018). </w:t>
+      <w:bookmarkEnd w:id="35"/>
+      <w:r>
+        <w:t xml:space="preserve">[35] Wang, A., Singh, A., Michael, J., Hill, F., Levy, O., and Bowman, S. R. (2019). </w:t>
       </w:r>
       <w:r>
         <w:rPr>
           <w:i/>
         </w:rPr>
-        <w:t xml:space="preserve">A Broad-Coverage Challenge Corpus for Sentence Understanding through Inference. </w:t>
-      </w:r>
-      <w:r>
-        <w:t xml:space="preserve">NAACL-HLT, 1112–1122. </w:t>
+        <w:t xml:space="preserve">GLUE: A Multi-Task Benchmark and Analysis Platform for Natural Language Understanding. </w:t>
+      </w:r>
+      <w:r>
+        <w:t xml:space="preserve">ICLR 2019; initial preprint 2018. </w:t>
       </w:r>
       <w:hyperlink r:id="rId46" w:history="1">
         <w:r>
@@ -12995,28 +12963,28 @@
           <w:color w:val="536579"/>
           <w:sz w:val="17"/>
         </w:rPr>
-        <w:t>Access: Primary abstract; MultiNLI matched/mismatched distinction.</w:t>
+        <w:t>Access: Primary benchmark description; distinguish standard GLUE from this small-data sequence.</w:t>
       </w:r>
     </w:p>
     <w:p>
-      <w:bookmarkStart w:id="37" w:name="reference_37"/>
+      <w:bookmarkStart w:id="36" w:name="reference_36"/>
       <w:pPr>
         <w:keepNext/>
         <w:spacing w:before="80" w:after="40"/>
         <w:ind w:left="454" w:hanging="454"/>
       </w:pPr>
-      <w:bookmarkEnd w:id="37"/>
-      <w:r>
-        <w:t xml:space="preserve">[37] Socher, R., et al. (2013). </w:t>
+      <w:bookmarkEnd w:id="36"/>
+      <w:r>
+        <w:t xml:space="preserve">[36] Williams, A., Nangia, N., and Bowman, S. R. (2018). </w:t>
       </w:r>
       <w:r>
         <w:rPr>
           <w:i/>
         </w:rPr>
-        <w:t xml:space="preserve">Recursive Deep Models for Semantic Compositionality Over a Sentiment Treebank. </w:t>
-      </w:r>
-      <w:r>
-        <w:t xml:space="preserve">EMNLP, 1631–1642. </w:t>
+        <w:t xml:space="preserve">A Broad-Coverage Challenge Corpus for Sentence Understanding through Inference. </w:t>
+      </w:r>
+      <w:r>
+        <w:t xml:space="preserve">NAACL-HLT, 1112–1122. </w:t>
       </w:r>
       <w:hyperlink r:id="rId47" w:history="1">
         <w:r>
@@ -13038,28 +13006,28 @@
           <w:color w:val="536579"/>
           <w:sz w:val="17"/>
         </w:rPr>
-        <w:t>Access: Primary abstract; sentiment dataset origin.</w:t>
+        <w:t>Access: Primary abstract; MultiNLI matched/mismatched distinction.</w:t>
       </w:r>
     </w:p>
     <w:p>
-      <w:bookmarkStart w:id="38" w:name="reference_38"/>
+      <w:bookmarkStart w:id="37" w:name="reference_37"/>
       <w:pPr>
         <w:keepNext/>
         <w:spacing w:before="80" w:after="40"/>
         <w:ind w:left="454" w:hanging="454"/>
       </w:pPr>
-      <w:bookmarkEnd w:id="38"/>
-      <w:r>
-        <w:t xml:space="preserve">[38] Dagan, I., Glickman, O., and Magnini, B. (2006). </w:t>
+      <w:bookmarkEnd w:id="37"/>
+      <w:r>
+        <w:t xml:space="preserve">[37] Socher, R., et al. (2013). </w:t>
       </w:r>
       <w:r>
         <w:rPr>
           <w:i/>
         </w:rPr>
-        <w:t xml:space="preserve">The PASCAL Recognising Textual Entailment Challenge. </w:t>
-      </w:r>
-      <w:r>
-        <w:t xml:space="preserve">Machine Learning Challenges, LNCS 3944, 177–190. </w:t>
+        <w:t xml:space="preserve">Recursive Deep Models for Semantic Compositionality Over a Sentiment Treebank. </w:t>
+      </w:r>
+      <w:r>
+        <w:t xml:space="preserve">EMNLP, 1631–1642. </w:t>
       </w:r>
       <w:hyperlink r:id="rId48" w:history="1">
         <w:r>
@@ -13081,28 +13049,28 @@
           <w:color w:val="536579"/>
           <w:sz w:val="17"/>
         </w:rPr>
-        <w:t>Access: Bibliographic context only. Publisher endpoint unavailable; no detailed original-paper finding attributed.</w:t>
+        <w:t>Access: Primary abstract; sentiment dataset origin.</w:t>
       </w:r>
     </w:p>
     <w:p>
-      <w:bookmarkStart w:id="39" w:name="reference_39"/>
+      <w:bookmarkStart w:id="38" w:name="reference_38"/>
       <w:pPr>
         <w:keepNext/>
         <w:spacing w:before="80" w:after="40"/>
         <w:ind w:left="454" w:hanging="454"/>
       </w:pPr>
-      <w:bookmarkEnd w:id="39"/>
-      <w:r>
-        <w:t xml:space="preserve">[39] Gururangan, S., et al. (2018). </w:t>
+      <w:bookmarkEnd w:id="38"/>
+      <w:r>
+        <w:t xml:space="preserve">[38] Dagan, I., Glickman, O., and Magnini, B. (2006). </w:t>
       </w:r>
       <w:r>
         <w:rPr>
           <w:i/>
         </w:rPr>
-        <w:t xml:space="preserve">Annotation Artifacts in Natural Language Inference Data. </w:t>
-      </w:r>
-      <w:r>
-        <w:t xml:space="preserve">NAACL-HLT 2018. </w:t>
+        <w:t xml:space="preserve">The PASCAL Recognising Textual Entailment Challenge. </w:t>
+      </w:r>
+      <w:r>
+        <w:t xml:space="preserve">Machine Learning Challenges, LNCS 3944, 177–190. </w:t>
       </w:r>
       <w:hyperlink r:id="rId49" w:history="1">
         <w:r>
@@ -13124,28 +13092,28 @@
           <w:color w:val="536579"/>
           <w:sz w:val="17"/>
         </w:rPr>
-        <w:t>Access: Primary abstract and hypothesis-only artifact analysis.</w:t>
+        <w:t>Access: Bibliographic context only. Publisher endpoint unavailable; no detailed original-paper finding attributed.</w:t>
       </w:r>
     </w:p>
     <w:p>
-      <w:bookmarkStart w:id="40" w:name="reference_40"/>
+      <w:bookmarkStart w:id="39" w:name="reference_39"/>
       <w:pPr>
         <w:keepNext/>
         <w:spacing w:before="80" w:after="40"/>
         <w:ind w:left="454" w:hanging="454"/>
       </w:pPr>
-      <w:bookmarkEnd w:id="40"/>
-      <w:r>
-        <w:t xml:space="preserve">[40] McCoy, R. T., Pavlick, E., and Linzen, T. (2019). </w:t>
+      <w:bookmarkEnd w:id="39"/>
+      <w:r>
+        <w:t xml:space="preserve">[39] Gururangan, S., et al. (2018). </w:t>
       </w:r>
       <w:r>
         <w:rPr>
           <w:i/>
         </w:rPr>
-        <w:t xml:space="preserve">Right for the Wrong Reasons: Diagnosing Syntactic Heuristics in Natural Language Inference. </w:t>
-      </w:r>
-      <w:r>
-        <w:t xml:space="preserve">ACL 2019. </w:t>
+        <w:t xml:space="preserve">Annotation Artifacts in Natural Language Inference Data. </w:t>
+      </w:r>
+      <w:r>
+        <w:t xml:space="preserve">NAACL-HLT 2018. </w:t>
       </w:r>
       <w:hyperlink r:id="rId50" w:history="1">
         <w:r>
@@ -13167,28 +13135,28 @@
           <w:color w:val="536579"/>
           <w:sz w:val="17"/>
         </w:rPr>
-        <w:t>Access: Primary abstract; HANS challenge evaluation.</w:t>
+        <w:t>Access: Primary abstract and hypothesis-only artifact analysis.</w:t>
       </w:r>
     </w:p>
     <w:p>
-      <w:bookmarkStart w:id="41" w:name="reference_41"/>
+      <w:bookmarkStart w:id="40" w:name="reference_40"/>
       <w:pPr>
         <w:keepNext/>
         <w:spacing w:before="80" w:after="40"/>
         <w:ind w:left="454" w:hanging="454"/>
       </w:pPr>
-      <w:bookmarkEnd w:id="41"/>
-      <w:r>
-        <w:t xml:space="preserve">[41] Dodge, J., et al. (2020). </w:t>
+      <w:bookmarkEnd w:id="40"/>
+      <w:r>
+        <w:t xml:space="preserve">[40] McCoy, R. T., Pavlick, E., and Linzen, T. (2019). </w:t>
       </w:r>
       <w:r>
         <w:rPr>
           <w:i/>
         </w:rPr>
-        <w:t xml:space="preserve">Fine-Tuning Pretrained Language Models: Weight Initializations, Data Orders, and Early Stopping. </w:t>
-      </w:r>
-      <w:r>
-        <w:t xml:space="preserve">arXiv:2002.06305v1. </w:t>
+        <w:t xml:space="preserve">Right for the Wrong Reasons: Diagnosing Syntactic Heuristics in Natural Language Inference. </w:t>
+      </w:r>
+      <w:r>
+        <w:t xml:space="preserve">ACL 2019. </w:t>
       </w:r>
       <w:hyperlink r:id="rId51" w:history="1">
         <w:r>
@@ -13210,28 +13178,28 @@
           <w:color w:val="536579"/>
           <w:sz w:val="17"/>
         </w:rPr>
-        <w:t>Access: Primary abstract; seed/data-order variation, not endorsement of outcome-dependent stopping here.</w:t>
+        <w:t>Access: Primary abstract; HANS challenge evaluation.</w:t>
       </w:r>
     </w:p>
     <w:p>
-      <w:bookmarkStart w:id="42" w:name="reference_42"/>
+      <w:bookmarkStart w:id="41" w:name="reference_41"/>
       <w:pPr>
         <w:keepNext/>
         <w:spacing w:before="80" w:after="40"/>
         <w:ind w:left="454" w:hanging="454"/>
       </w:pPr>
-      <w:bookmarkEnd w:id="42"/>
-      <w:r>
-        <w:t xml:space="preserve">[42] Mosbach, M., Andriushchenko, M., and Klakow, D. (2021). </w:t>
+      <w:bookmarkEnd w:id="41"/>
+      <w:r>
+        <w:t xml:space="preserve">[41] Dodge, J., et al. (2020). </w:t>
       </w:r>
       <w:r>
         <w:rPr>
           <w:i/>
         </w:rPr>
-        <w:t xml:space="preserve">On the Stability of Fine-tuning BERT: Misconceptions, Explanations, and Strong Baselines. </w:t>
-      </w:r>
-      <w:r>
-        <w:t xml:space="preserve">ICLR 2021. </w:t>
+        <w:t xml:space="preserve">Fine-Tuning Pretrained Language Models: Weight Initializations, Data Orders, and Early Stopping. </w:t>
+      </w:r>
+      <w:r>
+        <w:t xml:space="preserve">arXiv:2002.06305v1. </w:t>
       </w:r>
       <w:hyperlink r:id="rId52" w:history="1">
         <w:r>
@@ -13253,28 +13221,28 @@
           <w:color w:val="536579"/>
           <w:sz w:val="17"/>
         </w:rPr>
-        <w:t>Access: Primary abstract; GLUE optimization-failure diagnosis.</w:t>
+        <w:t>Access: Primary abstract; seed/data-order variation, not endorsement of outcome-dependent stopping here.</w:t>
       </w:r>
     </w:p>
     <w:p>
-      <w:bookmarkStart w:id="43" w:name="reference_43"/>
+      <w:bookmarkStart w:id="42" w:name="reference_42"/>
       <w:pPr>
         <w:keepNext/>
         <w:spacing w:before="80" w:after="40"/>
         <w:ind w:left="454" w:hanging="454"/>
       </w:pPr>
-      <w:bookmarkEnd w:id="43"/>
-      <w:r>
-        <w:t xml:space="preserve">[43] Dror, R., Baumer, G., Shlomov, S., and Reichart, R. (2018). </w:t>
+      <w:bookmarkEnd w:id="42"/>
+      <w:r>
+        <w:t xml:space="preserve">[42] Mosbach, M., Andriushchenko, M., and Klakow, D. (2021). </w:t>
       </w:r>
       <w:r>
         <w:rPr>
           <w:i/>
         </w:rPr>
-        <w:t xml:space="preserve">The Hitchhiker’s Guide to Testing Statistical Significance in Natural Language Processing. </w:t>
-      </w:r>
-      <w:r>
-        <w:t xml:space="preserve">ACL, 1383–1392. </w:t>
+        <w:t xml:space="preserve">On the Stability of Fine-tuning BERT: Misconceptions, Explanations, and Strong Baselines. </w:t>
+      </w:r>
+      <w:r>
+        <w:t xml:space="preserve">ICLR 2021. </w:t>
       </w:r>
       <w:hyperlink r:id="rId53" w:history="1">
         <w:r>
@@ -13296,28 +13264,28 @@
           <w:color w:val="536579"/>
           <w:sz w:val="17"/>
         </w:rPr>
-        <w:t>Access: Primary abstract and paired-test guidance.</w:t>
+        <w:t>Access: Primary abstract; GLUE optimization-failure diagnosis.</w:t>
       </w:r>
     </w:p>
     <w:p>
-      <w:bookmarkStart w:id="44" w:name="reference_44"/>
+      <w:bookmarkStart w:id="43" w:name="reference_43"/>
       <w:pPr>
         <w:keepNext/>
         <w:spacing w:before="80" w:after="40"/>
         <w:ind w:left="454" w:hanging="454"/>
       </w:pPr>
-      <w:bookmarkEnd w:id="44"/>
-      <w:r>
-        <w:t xml:space="preserve">[44] Guo, C., Pleiss, G., Sun, Y., and Weinberger, K. Q. (2017). </w:t>
+      <w:bookmarkEnd w:id="43"/>
+      <w:r>
+        <w:t xml:space="preserve">[43] Dror, R., Baumer, G., Shlomov, S., and Reichart, R. (2018). </w:t>
       </w:r>
       <w:r>
         <w:rPr>
           <w:i/>
         </w:rPr>
-        <w:t xml:space="preserve">On Calibration of Modern Neural Networks. </w:t>
-      </w:r>
-      <w:r>
-        <w:t xml:space="preserve">ICML, PMLR 70, 1321–1330. </w:t>
+        <w:t xml:space="preserve">The Hitchhiker’s Guide to Testing Statistical Significance in Natural Language Processing. </w:t>
+      </w:r>
+      <w:r>
+        <w:t xml:space="preserve">ACL, 1383–1392. </w:t>
       </w:r>
       <w:hyperlink r:id="rId54" w:history="1">
         <w:r>
@@ -13339,28 +13307,28 @@
           <w:color w:val="536579"/>
           <w:sz w:val="17"/>
         </w:rPr>
-        <w:t>Access: Primary abstract and calibration-metric context.</w:t>
+        <w:t>Access: Primary abstract and paired-test guidance.</w:t>
       </w:r>
     </w:p>
     <w:p>
-      <w:bookmarkStart w:id="45" w:name="reference_45"/>
+      <w:bookmarkStart w:id="44" w:name="reference_44"/>
       <w:pPr>
         <w:keepNext/>
         <w:spacing w:before="80" w:after="40"/>
         <w:ind w:left="454" w:hanging="454"/>
       </w:pPr>
-      <w:bookmarkEnd w:id="45"/>
-      <w:r>
-        <w:t xml:space="preserve">[45] Roy, O., and Vetterli, M. (2007). </w:t>
+      <w:bookmarkEnd w:id="44"/>
+      <w:r>
+        <w:t xml:space="preserve">[44] Guo, C., Pleiss, G., Sun, Y., and Weinberger, K. Q. (2017). </w:t>
       </w:r>
       <w:r>
         <w:rPr>
           <w:i/>
         </w:rPr>
-        <w:t xml:space="preserve">The Effective Rank: A Measure of Effective Dimensionality. </w:t>
-      </w:r>
-      <w:r>
-        <w:t xml:space="preserve">EUSIPCO, 606–610. </w:t>
+        <w:t xml:space="preserve">On Calibration of Modern Neural Networks. </w:t>
+      </w:r>
+      <w:r>
+        <w:t xml:space="preserve">ICML, PMLR 70, 1321–1330. </w:t>
       </w:r>
       <w:hyperlink r:id="rId55" w:history="1">
         <w:r>
@@ -13382,28 +13350,28 @@
           <w:color w:val="536579"/>
           <w:sz w:val="17"/>
         </w:rPr>
-        <w:t>Access: Primary conference deposit and indexed original definition.</w:t>
+        <w:t>Access: Primary abstract and calibration-metric context.</w:t>
       </w:r>
     </w:p>
     <w:p>
-      <w:bookmarkStart w:id="46" w:name="reference_46"/>
+      <w:bookmarkStart w:id="45" w:name="reference_45"/>
       <w:pPr>
         <w:keepNext/>
         <w:spacing w:before="80" w:after="40"/>
         <w:ind w:left="454" w:hanging="454"/>
       </w:pPr>
-      <w:bookmarkEnd w:id="46"/>
-      <w:r>
-        <w:t xml:space="preserve">[46] Kornblith, S., Norouzi, M., Lee, H., and Hinton, G. (2019). </w:t>
+      <w:bookmarkEnd w:id="45"/>
+      <w:r>
+        <w:t xml:space="preserve">[45] Roy, O., and Vetterli, M. (2007). </w:t>
       </w:r>
       <w:r>
         <w:rPr>
           <w:i/>
         </w:rPr>
-        <w:t xml:space="preserve">Similarity of Neural Network Representations Revisited. </w:t>
-      </w:r>
-      <w:r>
-        <w:t xml:space="preserve">ICML, PMLR 97, 3519–3529. </w:t>
+        <w:t xml:space="preserve">The Effective Rank: A Measure of Effective Dimensionality. </w:t>
+      </w:r>
+      <w:r>
+        <w:t xml:space="preserve">EUSIPCO, 606–610. </w:t>
       </w:r>
       <w:hyperlink r:id="rId56" w:history="1">
         <w:r>
@@ -13425,28 +13393,28 @@
           <w:color w:val="536579"/>
           <w:sz w:val="17"/>
         </w:rPr>
-        <w:t>Access: Primary abstract; centered kernel alignment.</w:t>
+        <w:t>Access: Primary conference deposit and indexed original definition.</w:t>
       </w:r>
     </w:p>
     <w:p>
-      <w:bookmarkStart w:id="47" w:name="reference_47"/>
+      <w:bookmarkStart w:id="46" w:name="reference_46"/>
       <w:pPr>
         <w:keepNext/>
         <w:spacing w:before="80" w:after="40"/>
         <w:ind w:left="454" w:hanging="454"/>
       </w:pPr>
-      <w:bookmarkEnd w:id="47"/>
-      <w:r>
-        <w:t xml:space="preserve">[47] SciPy contributors (version 1.15.3). </w:t>
+      <w:bookmarkEnd w:id="46"/>
+      <w:r>
+        <w:t xml:space="preserve">[46] Kornblith, S., Norouzi, M., Lee, H., and Hinton, G. (2019). </w:t>
       </w:r>
       <w:r>
         <w:rPr>
           <w:i/>
         </w:rPr>
-        <w:t xml:space="preserve">scipy.linalg.subspace_angles. </w:t>
-      </w:r>
-      <w:r>
-        <w:t xml:space="preserve">Official implementation documentation, not an experimental paper. </w:t>
+        <w:t xml:space="preserve">Similarity of Neural Network Representations Revisited. </w:t>
+      </w:r>
+      <w:r>
+        <w:t xml:space="preserve">ICML, PMLR 97, 3519–3529. </w:t>
       </w:r>
       <w:hyperlink r:id="rId57" w:history="1">
         <w:r>
@@ -13468,28 +13436,28 @@
           <w:color w:val="536579"/>
           <w:sz w:val="17"/>
         </w:rPr>
-        <w:t>Access: Official method documentation.</w:t>
+        <w:t>Access: Primary abstract; centered kernel alignment.</w:t>
       </w:r>
     </w:p>
     <w:p>
-      <w:bookmarkStart w:id="48" w:name="reference_48"/>
+      <w:bookmarkStart w:id="47" w:name="reference_47"/>
       <w:pPr>
         <w:keepNext/>
         <w:spacing w:before="80" w:after="40"/>
         <w:ind w:left="454" w:hanging="454"/>
       </w:pPr>
-      <w:bookmarkEnd w:id="48"/>
-      <w:r>
-        <w:t xml:space="preserve">[48] Dettmers, T., Lewis, M., Shleifer, S., and Zettlemoyer, L. (2022). </w:t>
+      <w:bookmarkEnd w:id="47"/>
+      <w:r>
+        <w:t xml:space="preserve">[47] SciPy contributors (version 1.15.3). </w:t>
       </w:r>
       <w:r>
         <w:rPr>
           <w:i/>
         </w:rPr>
-        <w:t xml:space="preserve">8-bit Optimizers via Block-wise Quantization. </w:t>
-      </w:r>
-      <w:r>
-        <w:t xml:space="preserve">ICLR 2022; initial preprint 2021. </w:t>
+        <w:t xml:space="preserve">scipy.linalg.subspace_angles. </w:t>
+      </w:r>
+      <w:r>
+        <w:t xml:space="preserve">Official implementation documentation, not an experimental paper. </w:t>
       </w:r>
       <w:hyperlink r:id="rId58" w:history="1">
         <w:r>
@@ -13511,28 +13479,28 @@
           <w:color w:val="536579"/>
           <w:sz w:val="17"/>
         </w:rPr>
-        <w:t>Access: Primary abstract; optimizer-state quantization and memory.</w:t>
+        <w:t>Access: Official method documentation.</w:t>
       </w:r>
     </w:p>
     <w:p>
-      <w:bookmarkStart w:id="49" w:name="reference_49"/>
+      <w:bookmarkStart w:id="48" w:name="reference_48"/>
       <w:pPr>
         <w:keepNext/>
         <w:spacing w:before="80" w:after="40"/>
         <w:ind w:left="454" w:hanging="454"/>
       </w:pPr>
-      <w:bookmarkEnd w:id="49"/>
-      <w:r>
-        <w:t xml:space="preserve">[49] Zamirai, P., Zhang, J., Aberger, C. R., and De Sa, C. (2020; revision 2021). </w:t>
+      <w:bookmarkEnd w:id="48"/>
+      <w:r>
+        <w:t xml:space="preserve">[48] Dettmers, T., Lewis, M., Shleifer, S., and Zettlemoyer, L. (2022). </w:t>
       </w:r>
       <w:r>
         <w:rPr>
           <w:i/>
         </w:rPr>
-        <w:t xml:space="preserve">Revisiting BFloat16 Training. </w:t>
-      </w:r>
-      <w:r>
-        <w:t xml:space="preserve">arXiv:2010.06192v2. </w:t>
+        <w:t xml:space="preserve">8-bit Optimizers via Block-wise Quantization. </w:t>
+      </w:r>
+      <w:r>
+        <w:t xml:space="preserve">ICLR 2022; initial preprint 2021. </w:t>
       </w:r>
       <w:hyperlink r:id="rId59" w:history="1">
         <w:r>
@@ -13554,28 +13522,28 @@
           <w:color w:val="536579"/>
           <w:sz w:val="17"/>
         </w:rPr>
-        <w:t>Access: Primary abstract; cancellation of small low-precision weight updates.</w:t>
+        <w:t>Access: Primary abstract; optimizer-state quantization and memory.</w:t>
       </w:r>
     </w:p>
     <w:p>
-      <w:bookmarkStart w:id="50" w:name="reference_50"/>
+      <w:bookmarkStart w:id="49" w:name="reference_49"/>
       <w:pPr>
         <w:keepNext/>
         <w:spacing w:before="80" w:after="40"/>
         <w:ind w:left="454" w:hanging="454"/>
       </w:pPr>
-      <w:bookmarkEnd w:id="50"/>
-      <w:r>
-        <w:t xml:space="preserve">[50] Brown, T. B., et al. (2020). </w:t>
+      <w:bookmarkEnd w:id="49"/>
+      <w:r>
+        <w:t xml:space="preserve">[49] Zamirai, P., Zhang, J., Aberger, C. R., and De Sa, C. (2020; revision 2021). </w:t>
       </w:r>
       <w:r>
         <w:rPr>
           <w:i/>
         </w:rPr>
-        <w:t xml:space="preserve">Language Models are Few-Shot Learners. </w:t>
-      </w:r>
-      <w:r>
-        <w:t xml:space="preserve">NeurIPS 33. </w:t>
+        <w:t xml:space="preserve">Revisiting BFloat16 Training. </w:t>
+      </w:r>
+      <w:r>
+        <w:t xml:space="preserve">arXiv:2010.06192v2. </w:t>
       </w:r>
       <w:hyperlink r:id="rId60" w:history="1">
         <w:r>
@@ -13597,28 +13565,28 @@
           <w:color w:val="536579"/>
           <w:sz w:val="17"/>
         </w:rPr>
-        <w:t>Access: Primary paper and Table 2.1 context. Pretraining rates do not establish this suite's fine-tuning exponent.</w:t>
+        <w:t>Access: Primary abstract; cancellation of small low-precision weight updates.</w:t>
       </w:r>
     </w:p>
     <w:p>
-      <w:bookmarkStart w:id="51" w:name="reference_51"/>
+      <w:bookmarkStart w:id="50" w:name="reference_50"/>
       <w:pPr>
         <w:keepNext/>
         <w:spacing w:before="80" w:after="40"/>
         <w:ind w:left="454" w:hanging="454"/>
       </w:pPr>
-      <w:bookmarkEnd w:id="51"/>
-      <w:r>
-        <w:t xml:space="preserve">[51] Yang, G., et al. (2022). </w:t>
+      <w:bookmarkEnd w:id="50"/>
+      <w:r>
+        <w:t xml:space="preserve">[50] Brown, T. B., et al. (2020). </w:t>
       </w:r>
       <w:r>
         <w:rPr>
           <w:i/>
         </w:rPr>
-        <w:t xml:space="preserve">Tensor Programs V: Tuning Large Neural Networks via Zero-Shot Hyperparameter Transfer. </w:t>
-      </w:r>
-      <w:r>
-        <w:t xml:space="preserve">NeurIPS 35. </w:t>
+        <w:t xml:space="preserve">Language Models are Few-Shot Learners. </w:t>
+      </w:r>
+      <w:r>
+        <w:t xml:space="preserve">NeurIPS 33. </w:t>
       </w:r>
       <w:hyperlink r:id="rId61" w:history="1">
         <w:r>
@@ -13640,28 +13608,28 @@
           <w:color w:val="536579"/>
           <w:sz w:val="17"/>
         </w:rPr>
-        <w:t>Access: Primary abstract; parameterization-specific hyperparameter transfer.</w:t>
+        <w:t>Access: Primary paper and Table 2.1 context. Pretraining rates do not establish this suite's fine-tuning exponent.</w:t>
       </w:r>
     </w:p>
     <w:p>
-      <w:bookmarkStart w:id="52" w:name="reference_52"/>
+      <w:bookmarkStart w:id="51" w:name="reference_51"/>
       <w:pPr>
         <w:keepNext/>
         <w:spacing w:before="80" w:after="40"/>
         <w:ind w:left="454" w:hanging="454"/>
       </w:pPr>
-      <w:bookmarkEnd w:id="52"/>
-      <w:r>
-        <w:t xml:space="preserve">[52] Meta (2024). </w:t>
+      <w:bookmarkEnd w:id="51"/>
+      <w:r>
+        <w:t xml:space="preserve">[51] Yang, G., et al. (2022). </w:t>
       </w:r>
       <w:r>
         <w:rPr>
           <w:i/>
         </w:rPr>
-        <w:t xml:space="preserve">Llama-3.2-1B model card. </w:t>
-      </w:r>
-      <w:r>
-        <w:t xml:space="preserve">Official model documentation. </w:t>
+        <w:t xml:space="preserve">Tensor Programs V: Tuning Large Neural Networks via Zero-Shot Hyperparameter Transfer. </w:t>
+      </w:r>
+      <w:r>
+        <w:t xml:space="preserve">NeurIPS 35. </w:t>
       </w:r>
       <w:hyperlink r:id="rId62" w:history="1">
         <w:r>
@@ -13683,25 +13651,25 @@
           <w:color w:val="536579"/>
           <w:sz w:val="17"/>
         </w:rPr>
-        <w:t>Access: Official card: pruning/distillation, base checkpoint, release and architecture.</w:t>
+        <w:t>Access: Primary abstract; parameterization-specific hyperparameter transfer.</w:t>
       </w:r>
     </w:p>
     <w:p>
-      <w:bookmarkStart w:id="53" w:name="reference_53"/>
+      <w:bookmarkStart w:id="52" w:name="reference_52"/>
       <w:pPr>
         <w:keepNext/>
         <w:spacing w:before="80" w:after="40"/>
         <w:ind w:left="454" w:hanging="454"/>
       </w:pPr>
-      <w:bookmarkEnd w:id="53"/>
-      <w:r>
-        <w:t xml:space="preserve">[53] Qwen Team (2024). </w:t>
+      <w:bookmarkEnd w:id="52"/>
+      <w:r>
+        <w:t xml:space="preserve">[52] Meta (2024). </w:t>
       </w:r>
       <w:r>
         <w:rPr>
           <w:i/>
         </w:rPr>
-        <w:t xml:space="preserve">Qwen2.5-1.5B model card. </w:t>
+        <w:t xml:space="preserve">Llama-3.2-1B model card. </w:t>
       </w:r>
       <w:r>
         <w:t xml:space="preserve">Official model documentation. </w:t>
@@ -13726,25 +13694,25 @@
           <w:color w:val="536579"/>
           <w:sz w:val="17"/>
         </w:rPr>
-        <w:t>Access: Official card and project-pinned configuration.</w:t>
+        <w:t>Access: Official card: pruning/distillation, base checkpoint, release and architecture.</w:t>
       </w:r>
     </w:p>
     <w:p>
-      <w:bookmarkStart w:id="54" w:name="reference_54"/>
+      <w:bookmarkStart w:id="53" w:name="reference_53"/>
       <w:pPr>
         <w:keepNext/>
         <w:spacing w:before="80" w:after="40"/>
         <w:ind w:left="454" w:hanging="454"/>
       </w:pPr>
-      <w:bookmarkEnd w:id="54"/>
-      <w:r>
-        <w:t xml:space="preserve">[54] Qwen Team (2024). </w:t>
+      <w:bookmarkEnd w:id="53"/>
+      <w:r>
+        <w:t xml:space="preserve">[53] Qwen Team (2024). </w:t>
       </w:r>
       <w:r>
         <w:rPr>
           <w:i/>
         </w:rPr>
-        <w:t xml:space="preserve">Qwen2.5-3B model card. </w:t>
+        <w:t xml:space="preserve">Qwen2.5-1.5B model card. </w:t>
       </w:r>
       <w:r>
         <w:t xml:space="preserve">Official model documentation. </w:t>
@@ -13769,25 +13737,25 @@
           <w:color w:val="536579"/>
           <w:sz w:val="17"/>
         </w:rPr>
-        <w:t>Access: Official card: 3.09B total, 2.77B non-embedding, GQA and Qwen Research License.</w:t>
+        <w:t>Access: Official card and project-pinned configuration.</w:t>
       </w:r>
     </w:p>
     <w:p>
-      <w:bookmarkStart w:id="55" w:name="reference_55"/>
+      <w:bookmarkStart w:id="54" w:name="reference_54"/>
       <w:pPr>
         <w:keepNext/>
         <w:spacing w:before="80" w:after="40"/>
         <w:ind w:left="454" w:hanging="454"/>
       </w:pPr>
-      <w:bookmarkEnd w:id="55"/>
-      <w:r>
-        <w:t xml:space="preserve">[55] IBM Granite Team (2025). </w:t>
+      <w:bookmarkEnd w:id="54"/>
+      <w:r>
+        <w:t xml:space="preserve">[54] Qwen Team (2024). </w:t>
       </w:r>
       <w:r>
         <w:rPr>
           <w:i/>
         </w:rPr>
-        <w:t xml:space="preserve">Granite-3.3-2b-base model card. </w:t>
+        <w:t xml:space="preserve">Qwen2.5-3B model card. </w:t>
       </w:r>
       <w:r>
         <w:t xml:space="preserve">Official model documentation. </w:t>
@@ -13812,28 +13780,28 @@
           <w:color w:val="536579"/>
           <w:sz w:val="17"/>
         </w:rPr>
-        <w:t>Access: Official card: release 16 April 2025 and architecture table.</w:t>
+        <w:t>Access: Official card: 3.09B total, 2.77B non-embedding, GQA and Qwen Research License.</w:t>
       </w:r>
     </w:p>
     <w:p>
-      <w:bookmarkStart w:id="56" w:name="reference_56"/>
+      <w:bookmarkStart w:id="55" w:name="reference_55"/>
       <w:pPr>
         <w:keepNext/>
         <w:spacing w:before="80" w:after="40"/>
         <w:ind w:left="454" w:hanging="454"/>
       </w:pPr>
-      <w:bookmarkEnd w:id="56"/>
-      <w:r>
-        <w:t xml:space="preserve">[56] Ainslie, J., et al. (2023). </w:t>
+      <w:bookmarkEnd w:id="55"/>
+      <w:r>
+        <w:t xml:space="preserve">[55] IBM Granite Team (2025). </w:t>
       </w:r>
       <w:r>
         <w:rPr>
           <w:i/>
         </w:rPr>
-        <w:t xml:space="preserve">GQA: Training Generalized Multi-Query Transformer Models from Multi-Head Checkpoints. </w:t>
-      </w:r>
-      <w:r>
-        <w:t xml:space="preserve">EMNLP 2023. </w:t>
+        <w:t xml:space="preserve">Granite-3.3-2b-base model card. </w:t>
+      </w:r>
+      <w:r>
+        <w:t xml:space="preserve">Official model documentation. </w:t>
       </w:r>
       <w:hyperlink r:id="rId66" w:history="1">
         <w:r>
@@ -13855,28 +13823,28 @@
           <w:color w:val="536579"/>
           <w:sz w:val="17"/>
         </w:rPr>
-        <w:t>Access: Primary abstract; grouped-query geometry.</w:t>
+        <w:t>Access: Official card: release 16 April 2025 and architecture table.</w:t>
       </w:r>
     </w:p>
     <w:p>
-      <w:bookmarkStart w:id="57" w:name="reference_57"/>
+      <w:bookmarkStart w:id="56" w:name="reference_56"/>
       <w:pPr>
         <w:keepNext/>
         <w:spacing w:before="80" w:after="40"/>
         <w:ind w:left="454" w:hanging="454"/>
       </w:pPr>
-      <w:bookmarkEnd w:id="57"/>
-      <w:r>
-        <w:t xml:space="preserve">[57] Hwang, T., Seo, H., Jung, J., and Jung, S. (2025). </w:t>
+      <w:bookmarkEnd w:id="56"/>
+      <w:r>
+        <w:t xml:space="preserve">[56] Ainslie, J., et al. (2023). </w:t>
       </w:r>
       <w:r>
         <w:rPr>
           <w:i/>
         </w:rPr>
-        <w:t xml:space="preserve">Exploring Selective Layer Freezing Strategies in Transformer Fine-Tuning: NLI Classifiers with Sub-3B Parameter Models. </w:t>
-      </w:r>
-      <w:r>
-        <w:t xml:space="preserve">Applied Sciences 15(19), article 10434. </w:t>
+        <w:t xml:space="preserve">GQA: Training Generalized Multi-Query Transformer Models from Multi-Head Checkpoints. </w:t>
+      </w:r>
+      <w:r>
+        <w:t xml:space="preserve">EMNLP 2023. </w:t>
       </w:r>
       <w:hyperlink r:id="rId67" w:history="1">
         <w:r>
@@ -13898,28 +13866,28 @@
           <w:color w:val="536579"/>
           <w:sz w:val="17"/>
         </w:rPr>
-        <w:t>Access: Indexed primary methods, hyperparameters and limitations; direct delivery intermittently failed. Author-institution abstract also checked.</w:t>
+        <w:t>Access: Primary abstract; grouped-query geometry.</w:t>
       </w:r>
     </w:p>
     <w:p>
-      <w:bookmarkStart w:id="58" w:name="reference_58"/>
+      <w:bookmarkStart w:id="57" w:name="reference_57"/>
       <w:pPr>
         <w:keepNext/>
         <w:spacing w:before="80" w:after="40"/>
         <w:ind w:left="454" w:hanging="454"/>
       </w:pPr>
-      <w:bookmarkEnd w:id="58"/>
-      <w:r>
-        <w:t xml:space="preserve">[58] Loshchilov, I., and Hutter, F. (2019). </w:t>
+      <w:bookmarkEnd w:id="57"/>
+      <w:r>
+        <w:t xml:space="preserve">[57] Hwang, T., Seo, H., Jung, J., and Jung, S. (2025). </w:t>
       </w:r>
       <w:r>
         <w:rPr>
           <w:i/>
         </w:rPr>
-        <w:t xml:space="preserve">Decoupled Weight Decay Regularization. </w:t>
-      </w:r>
-      <w:r>
-        <w:t xml:space="preserve">ICLR 2019. </w:t>
+        <w:t xml:space="preserve">Exploring Selective Layer Freezing Strategies in Transformer Fine-Tuning: NLI Classifiers with Sub-3B Parameter Models. </w:t>
+      </w:r>
+      <w:r>
+        <w:t xml:space="preserve">Applied Sciences 15(19), article 10434. </w:t>
       </w:r>
       <w:hyperlink r:id="rId68" w:history="1">
         <w:r>
@@ -13941,28 +13909,28 @@
           <w:color w:val="536579"/>
           <w:sz w:val="17"/>
         </w:rPr>
-        <w:t>Access: Primary abstract; AdamW/weight-decay distinction.</w:t>
+        <w:t>Access: Indexed primary methods, hyperparameters and limitations; direct delivery intermittently failed. Author-institution abstract also checked.</w:t>
       </w:r>
     </w:p>
     <w:p>
-      <w:bookmarkStart w:id="59" w:name="reference_59"/>
+      <w:bookmarkStart w:id="58" w:name="reference_58"/>
       <w:pPr>
         <w:keepNext/>
         <w:spacing w:before="80" w:after="40"/>
         <w:ind w:left="454" w:hanging="454"/>
       </w:pPr>
-      <w:bookmarkEnd w:id="59"/>
-      <w:r>
-        <w:t xml:space="preserve">[59] Merity, S., Xiong, C., Bradbury, J., and Socher, R. (2017). </w:t>
+      <w:bookmarkEnd w:id="58"/>
+      <w:r>
+        <w:t xml:space="preserve">[58] Loshchilov, I., and Hutter, F. (2019). </w:t>
       </w:r>
       <w:r>
         <w:rPr>
           <w:i/>
         </w:rPr>
-        <w:t xml:space="preserve">Pointer Sentinel Mixture Models. </w:t>
-      </w:r>
-      <w:r>
-        <w:t xml:space="preserve">ICLR 2017; initial preprint 2016. </w:t>
+        <w:t xml:space="preserve">Decoupled Weight Decay Regularization. </w:t>
+      </w:r>
+      <w:r>
+        <w:t xml:space="preserve">ICLR 2019. </w:t>
       </w:r>
       <w:hyperlink r:id="rId69" w:history="1">
         <w:r>
@@ -13984,28 +13952,28 @@
           <w:color w:val="536579"/>
           <w:sz w:val="17"/>
         </w:rPr>
-        <w:t>Access: Primary abstract; WikiText origin, proposed only as an external retention proxy.</w:t>
+        <w:t>Access: Primary abstract; AdamW/weight-decay distinction.</w:t>
       </w:r>
     </w:p>
     <w:p>
-      <w:bookmarkStart w:id="60" w:name="reference_60"/>
+      <w:bookmarkStart w:id="59" w:name="reference_59"/>
       <w:pPr>
         <w:keepNext/>
         <w:spacing w:before="80" w:after="40"/>
         <w:ind w:left="454" w:hanging="454"/>
       </w:pPr>
-      <w:bookmarkEnd w:id="60"/>
-      <w:r>
-        <w:t xml:space="preserve">[60] Choi, H. (2026). </w:t>
+      <w:bookmarkEnd w:id="59"/>
+      <w:r>
+        <w:t xml:space="preserve">[59] Merity, S., Xiong, C., Bradbury, J., and Socher, R. (2017). </w:t>
       </w:r>
       <w:r>
         <w:rPr>
           <w:i/>
         </w:rPr>
-        <w:t xml:space="preserve">Beyond Endpoint Scores: Time- and Capacity-Conditioned Evaluation of Continual Knowledge Updating. </w:t>
-      </w:r>
-      <w:r>
-        <w:t xml:space="preserve">arXiv:2609.03900v1, 3 September; preprint. </w:t>
+        <w:t xml:space="preserve">Pointer Sentinel Mixture Models. </w:t>
+      </w:r>
+      <w:r>
+        <w:t xml:space="preserve">ICLR 2017; initial preprint 2016. </w:t>
       </w:r>
       <w:hyperlink r:id="rId70" w:history="1">
         <w:r>
@@ -14027,28 +13995,28 @@
           <w:color w:val="536579"/>
           <w:sz w:val="17"/>
         </w:rPr>
-        <w:t>Access: Targeted full text: evaluation protocol, capacity/endpoint reversals, cost and novelty boundary. Includes two fixed project models.</w:t>
+        <w:t>Access: Primary abstract; WikiText origin, proposed only as an external retention proxy.</w:t>
       </w:r>
     </w:p>
     <w:p>
-      <w:bookmarkStart w:id="61" w:name="reference_61"/>
+      <w:bookmarkStart w:id="60" w:name="reference_60"/>
       <w:pPr>
         <w:keepNext/>
         <w:spacing w:before="80" w:after="40"/>
         <w:ind w:left="454" w:hanging="454"/>
       </w:pPr>
-      <w:bookmarkEnd w:id="61"/>
-      <w:r>
-        <w:t xml:space="preserve">[61] Pethkar, K., Xiong, Z., Shang, Z., and Li, Y. (2026). </w:t>
+      <w:bookmarkEnd w:id="60"/>
+      <w:r>
+        <w:t xml:space="preserve">[60] Choi, H. (2026). </w:t>
       </w:r>
       <w:r>
         <w:rPr>
           <w:i/>
         </w:rPr>
-        <w:t xml:space="preserve">Memory as a Markov Matrix: Sample Efficient Knowledge Expansion via Token-to-Dictionary Mapping. </w:t>
-      </w:r>
-      <w:r>
-        <w:t xml:space="preserve">ICML, PMLR 306, 98373–98396. </w:t>
+        <w:t xml:space="preserve">Beyond Endpoint Scores: Time- and Capacity-Conditioned Evaluation of Continual Knowledge Updating. </w:t>
+      </w:r>
+      <w:r>
+        <w:t xml:space="preserve">arXiv:2609.03900v1, 3 September; preprint. </w:t>
       </w:r>
       <w:hyperlink r:id="rId71" w:history="1">
         <w:r>
@@ -14070,6 +14038,49 @@
           <w:color w:val="536579"/>
           <w:sz w:val="17"/>
         </w:rPr>
+        <w:t>Access: Targeted full text: evaluation protocol, capacity/endpoint reversals, cost and novelty boundary. Includes two fixed project models.</w:t>
+      </w:r>
+    </w:p>
+    <w:p>
+      <w:bookmarkStart w:id="61" w:name="reference_61"/>
+      <w:pPr>
+        <w:keepNext/>
+        <w:spacing w:before="80" w:after="40"/>
+        <w:ind w:left="454" w:hanging="454"/>
+      </w:pPr>
+      <w:bookmarkEnd w:id="61"/>
+      <w:r>
+        <w:t xml:space="preserve">[61] Pethkar, K., Xiong, Z., Shang, Z., and Li, Y. (2026). </w:t>
+      </w:r>
+      <w:r>
+        <w:rPr>
+          <w:i/>
+        </w:rPr>
+        <w:t xml:space="preserve">Memory as a Markov Matrix: Sample Efficient Knowledge Expansion via Token-to-Dictionary Mapping. </w:t>
+      </w:r>
+      <w:r>
+        <w:t xml:space="preserve">ICML, PMLR 306, 98373–98396. </w:t>
+      </w:r>
+      <w:hyperlink r:id="rId72" w:history="1">
+        <w:r>
+          <w:rPr>
+            <w:color w:val="1F4E78"/>
+            <w:sz w:val="20"/>
+          </w:rPr>
+          <w:t xml:space="preserve">Primary source</w:t>
+        </w:r>
+      </w:hyperlink>
+    </w:p>
+    <w:p>
+      <w:pPr>
+        <w:spacing w:after="100"/>
+        <w:ind w:left="454"/>
+      </w:pPr>
+      <w:r>
+        <w:rPr>
+          <w:color w:val="536579"/>
+          <w:sz w:val="17"/>
+        </w:rPr>
         <w:t>Access: Primary abstract; alternative memory mechanism, not a vanilla rank/BWT experiment.</w:t>
       </w:r>
     </w:p>
@@ -14093,7 +14104,7 @@
       <w:r>
         <w:t xml:space="preserve">Anonymous ACL submission; publication status unverified. </w:t>
       </w:r>
-      <w:hyperlink r:id="rId72" w:history="1">
+      <w:hyperlink r:id="rId73" w:history="1">
         <w:r>
           <w:rPr>
             <w:color w:val="1F4E78"/>

</xml_diff>